<commit_message>
Change of template for resumes
</commit_message>
<xml_diff>
--- a/resumes/resume_2026_academic.docx
+++ b/resumes/resume_2026_academic.docx
@@ -5,203 +5,495 @@
     <w:p>
       <w:pPr>
         <w:pStyle w:val="Title"/>
-      </w:pPr>
-      <w:r>
-        <w:t>Luigui Gallardo-Becerra</w:t>
+        <w:jc w:val="center"/>
+        <w:rPr>
+          <w:lang w:val="es-ES"/>
+        </w:rPr>
+      </w:pPr>
+      <w:r>
+        <w:rPr>
+          <w:lang w:val="es-ES"/>
+        </w:rPr>
+        <w:t>Luigui Gallardo</w:t>
+      </w:r>
+      <w:r>
+        <w:rPr>
+          <w:lang w:val="es-ES"/>
+        </w:rPr>
+        <w:t>-</w:t>
+      </w:r>
+      <w:r>
+        <w:rPr>
+          <w:lang w:val="es-ES"/>
+        </w:rPr>
+        <w:t>Becerra</w:t>
+      </w:r>
+    </w:p>
+    <w:p>
+      <w:pPr>
+        <w:pStyle w:val="Title"/>
+        <w:jc w:val="center"/>
+        <w:rPr>
+          <w:b w:val="0"/>
+          <w:bCs w:val="0"/>
+          <w:sz w:val="20"/>
+          <w:szCs w:val="26"/>
+          <w:lang w:val="es-ES"/>
+        </w:rPr>
+      </w:pPr>
+      <w:r>
+        <w:rPr>
+          <w:b w:val="0"/>
+          <w:bCs w:val="0"/>
+          <w:sz w:val="20"/>
+          <w:szCs w:val="26"/>
+          <w:lang w:val="es-ES"/>
+        </w:rPr>
+        <w:t xml:space="preserve">Bioinformatician </w:t>
+      </w:r>
+      <w:r>
+        <w:rPr>
+          <w:b w:val="0"/>
+          <w:bCs w:val="0"/>
+          <w:sz w:val="20"/>
+          <w:szCs w:val="26"/>
+          <w:lang w:val="es-ES"/>
+        </w:rPr>
+        <w:t xml:space="preserve">| </w:t>
+      </w:r>
+      <w:r>
+        <w:rPr>
+          <w:b w:val="0"/>
+          <w:bCs w:val="0"/>
+          <w:sz w:val="20"/>
+          <w:szCs w:val="26"/>
+          <w:lang w:val="es-ES"/>
+        </w:rPr>
+        <w:t>Molecular Biologist</w:t>
+      </w:r>
+    </w:p>
+    <w:p>
+      <w:pPr>
+        <w:pStyle w:val="Subtitle"/>
+        <w:jc w:val="center"/>
+        <w:rPr>
+          <w:lang w:val="es-ES"/>
+        </w:rPr>
+      </w:pPr>
+      <w:r>
+        <w:rPr>
+          <w:lang w:val="es-ES"/>
+        </w:rPr>
+        <w:t xml:space="preserve">+1 619 602 0725 | </w:t>
+      </w:r>
+      <w:hyperlink r:id="rId9" w:history="1">
+        <w:r>
+          <w:rPr>
+            <w:rStyle w:val="Hyperlink"/>
+            <w:lang w:val="es-ES"/>
+          </w:rPr>
+          <w:t>luiguimichelgallardo@gmail.com</w:t>
+        </w:r>
+      </w:hyperlink>
+      <w:r>
+        <w:rPr>
+          <w:lang w:val="es-ES"/>
+        </w:rPr>
+        <w:t xml:space="preserve"> | </w:t>
+      </w:r>
+      <w:r>
+        <w:rPr>
+          <w:lang w:val="es-ES"/>
+        </w:rPr>
+        <w:fldChar w:fldCharType="begin"/>
+      </w:r>
+      <w:r>
+        <w:rPr>
+          <w:lang w:val="es-ES"/>
+        </w:rPr>
+        <w:instrText>HYPERLINK "http://www.lmgb.xyz/"</w:instrText>
+      </w:r>
+      <w:r>
+        <w:rPr>
+          <w:lang w:val="es-ES"/>
+        </w:rPr>
+      </w:r>
+      <w:r>
+        <w:rPr>
+          <w:lang w:val="es-ES"/>
+        </w:rPr>
+        <w:fldChar w:fldCharType="separate"/>
+      </w:r>
+      <w:r>
+        <w:rPr>
+          <w:rStyle w:val="Hyperlink"/>
+          <w:lang w:val="es-ES"/>
+        </w:rPr>
+        <w:t>www.lmgb.xyz</w:t>
+      </w:r>
+      <w:r>
+        <w:rPr>
+          <w:lang w:val="es-ES"/>
+        </w:rPr>
+        <w:fldChar w:fldCharType="end"/>
+      </w:r>
+      <w:r>
+        <w:rPr>
+          <w:lang w:val="es-ES"/>
+        </w:rPr>
+        <w:t xml:space="preserve"> | </w:t>
+      </w:r>
+      <w:proofErr w:type="spellStart"/>
+      <w:r>
+        <w:rPr>
+          <w:lang w:val="es-ES"/>
+        </w:rPr>
+        <w:t>github</w:t>
+      </w:r>
+      <w:proofErr w:type="spellEnd"/>
+      <w:r>
+        <w:rPr>
+          <w:lang w:val="es-ES"/>
+        </w:rPr>
+        <w:t xml:space="preserve">: </w:t>
+      </w:r>
+      <w:hyperlink r:id="rId10" w:history="1">
+        <w:proofErr w:type="spellStart"/>
+        <w:r>
+          <w:rPr>
+            <w:rStyle w:val="Hyperlink"/>
+            <w:lang w:val="es-ES"/>
+          </w:rPr>
+          <w:t>LuiguiGallardo</w:t>
+        </w:r>
+        <w:proofErr w:type="spellEnd"/>
+      </w:hyperlink>
+      <w:r>
+        <w:rPr>
+          <w:lang w:val="es-ES"/>
+        </w:rPr>
+        <w:t xml:space="preserve"> | </w:t>
+      </w:r>
+      <w:proofErr w:type="spellStart"/>
+      <w:r>
+        <w:rPr>
+          <w:lang w:val="es-ES"/>
+        </w:rPr>
+        <w:t>linkedin</w:t>
+      </w:r>
+      <w:proofErr w:type="spellEnd"/>
+      <w:r>
+        <w:rPr>
+          <w:lang w:val="es-ES"/>
+        </w:rPr>
+        <w:t xml:space="preserve">: </w:t>
+      </w:r>
+      <w:hyperlink r:id="rId11" w:history="1">
+        <w:proofErr w:type="spellStart"/>
+        <w:r>
+          <w:rPr>
+            <w:rStyle w:val="Hyperlink"/>
+            <w:lang w:val="es-ES"/>
+          </w:rPr>
+          <w:t>luiguigallardo</w:t>
+        </w:r>
+        <w:proofErr w:type="spellEnd"/>
+      </w:hyperlink>
+    </w:p>
+    <w:p>
+      <w:pPr>
+        <w:pStyle w:val="Heading1"/>
+        <w:jc w:val="both"/>
+      </w:pPr>
+      <w:r>
+        <w:t>Career Summary</w:t>
+      </w:r>
+    </w:p>
+    <w:p>
+      <w:pPr>
+        <w:jc w:val="both"/>
+      </w:pPr>
+      <w:r>
+        <w:t>Experienced Bioinformatician and Molecular Biologist seeking new challenges to apply and expand my expertise in computational biology, data science, and molecular research. Over the past several years, I have contributed to diverse research projects utilizing modern genomic technologies (NGS), advanced data analysis, and data science methodologies to generate novel biological insights that have resulted in high-impact peer-reviewed scientific publications.</w:t>
+      </w:r>
+    </w:p>
+    <w:p>
+      <w:pPr>
+        <w:pStyle w:val="Heading1"/>
+        <w:jc w:val="both"/>
+      </w:pPr>
+      <w:r>
+        <w:t>Research Experience</w:t>
+      </w:r>
+    </w:p>
+    <w:p>
+      <w:pPr>
+        <w:pStyle w:val="Heading2"/>
+        <w:jc w:val="both"/>
+        <w:rPr>
+          <w:b/>
+          <w:bCs w:val="0"/>
+        </w:rPr>
+      </w:pPr>
+      <w:r>
+        <w:rPr>
+          <w:b/>
+          <w:bCs w:val="0"/>
+        </w:rPr>
+        <w:t>Graduate Research Assistant (Bioinformatics &amp; Molecular Biology) | Institute of Biotechnology, UNAM</w:t>
+      </w:r>
+      <w:r>
+        <w:rPr>
+          <w:b/>
+          <w:bCs w:val="0"/>
+        </w:rPr>
         <w:tab/>
-        <w:t>Bioinformatician | Molecular Biologist</w:t>
-      </w:r>
-    </w:p>
-    <w:p>
-      <w:pPr>
-        <w:pStyle w:val="Subtitle"/>
-      </w:pPr>
-      <w:r>
-        <w:t>+1 619 602 0725 | luiguimichelgallardo@gmail.com | www.lmgb.xyz | github: LuiguiGallardo | linkedin: luiguigallardo</w:t>
+        <w:t xml:space="preserve">January 2019 - </w:t>
+      </w:r>
+      <w:r>
+        <w:rPr>
+          <w:b/>
+          <w:bCs w:val="0"/>
+        </w:rPr>
+        <w:t>March</w:t>
+      </w:r>
+      <w:r>
+        <w:rPr>
+          <w:b/>
+          <w:bCs w:val="0"/>
+        </w:rPr>
+        <w:t xml:space="preserve"> 202</w:t>
+      </w:r>
+      <w:r>
+        <w:rPr>
+          <w:b/>
+          <w:bCs w:val="0"/>
+        </w:rPr>
+        <w:t>6</w:t>
+      </w:r>
+    </w:p>
+    <w:p>
+      <w:pPr>
+        <w:jc w:val="both"/>
+      </w:pPr>
+      <w:r>
+        <w:t>Across several interdisciplinary research projects, I contributed to data acquisition, computational analysis, and dissemination of scientific results. My responsibilities included:</w:t>
+      </w:r>
+    </w:p>
+    <w:p>
+      <w:pPr>
+        <w:pStyle w:val="ListBullet"/>
+        <w:jc w:val="both"/>
+      </w:pPr>
+      <w:r>
+        <w:rPr>
+          <w:b/>
+        </w:rPr>
+        <w:t>Project conceptualization:</w:t>
+      </w:r>
+      <w:r>
+        <w:t xml:space="preserve"> Assisted in defining research goals, experimental design, analytical workflows, and computational strategies to address multi-omics biological questions.</w:t>
+      </w:r>
+    </w:p>
+    <w:p>
+      <w:pPr>
+        <w:pStyle w:val="ListBullet"/>
+        <w:jc w:val="both"/>
+      </w:pPr>
+      <w:r>
+        <w:rPr>
+          <w:b/>
+        </w:rPr>
+        <w:t>HPC system administration:</w:t>
+      </w:r>
+      <w:r>
+        <w:t xml:space="preserve"> Maintained laboratory computational infrastructure, including Linux installation, software configuration, performance optimization, and data security practices.</w:t>
+      </w:r>
+    </w:p>
+    <w:p>
+      <w:pPr>
+        <w:pStyle w:val="ListBullet"/>
+        <w:jc w:val="both"/>
+      </w:pPr>
+      <w:r>
+        <w:rPr>
+          <w:b/>
+        </w:rPr>
+        <w:t>Reproducible workflow engineering:</w:t>
+      </w:r>
+      <w:r>
+        <w:t xml:space="preserve"> Built robust, scalable, and reproducible pipelines using </w:t>
+      </w:r>
+      <w:r>
+        <w:t xml:space="preserve">Bash, </w:t>
+      </w:r>
+      <w:proofErr w:type="spellStart"/>
+      <w:r>
+        <w:t>Nextflow</w:t>
+      </w:r>
+      <w:proofErr w:type="spellEnd"/>
+      <w:r>
+        <w:t xml:space="preserve">, and </w:t>
+      </w:r>
+      <w:proofErr w:type="spellStart"/>
+      <w:r>
+        <w:t>Snakemake</w:t>
+      </w:r>
+      <w:proofErr w:type="spellEnd"/>
+      <w:r>
+        <w:t>,</w:t>
+      </w:r>
+      <w:r>
+        <w:t xml:space="preserve"> to </w:t>
+      </w:r>
+      <w:r>
+        <w:t>automate NGS and metagenomic analyses.</w:t>
+      </w:r>
+    </w:p>
+    <w:p>
+      <w:pPr>
+        <w:pStyle w:val="ListBullet"/>
+        <w:jc w:val="both"/>
+      </w:pPr>
+      <w:r>
+        <w:rPr>
+          <w:b/>
+        </w:rPr>
+        <w:t>Custom tool development:</w:t>
+      </w:r>
+      <w:r>
+        <w:t xml:space="preserve"> Implemented specialized algorithms and utilities in Python, R, Bash, and </w:t>
+      </w:r>
+      <w:r>
+        <w:t>C#</w:t>
+      </w:r>
+      <w:r>
+        <w:t xml:space="preserve"> to support complex multi-step analyses.</w:t>
+      </w:r>
+    </w:p>
+    <w:p>
+      <w:pPr>
+        <w:pStyle w:val="ListBullet"/>
+        <w:jc w:val="both"/>
+      </w:pPr>
+      <w:r>
+        <w:rPr>
+          <w:b/>
+        </w:rPr>
+        <w:t>Quantitative data visualization:</w:t>
+      </w:r>
+      <w:r>
+        <w:t xml:space="preserve"> Designed comprehensive visualizations and figure panels using ggplot2, seaborn, matplotlib, and </w:t>
+      </w:r>
+      <w:proofErr w:type="spellStart"/>
+      <w:r>
+        <w:t>Jupyter</w:t>
+      </w:r>
+      <w:proofErr w:type="spellEnd"/>
+      <w:r>
+        <w:t xml:space="preserve"> Notebooks.</w:t>
+      </w:r>
+    </w:p>
+    <w:p>
+      <w:pPr>
+        <w:pStyle w:val="ListBullet"/>
+        <w:jc w:val="both"/>
+      </w:pPr>
+      <w:r>
+        <w:rPr>
+          <w:b/>
+        </w:rPr>
+        <w:t>Computational best practices:</w:t>
+      </w:r>
+      <w:r>
+        <w:t xml:space="preserve"> Maintained version control through GitHub repositories and incorporated CI/CD testing to ensure workflow reliability.</w:t>
+      </w:r>
+    </w:p>
+    <w:p>
+      <w:pPr>
+        <w:pStyle w:val="ListBullet"/>
+        <w:jc w:val="both"/>
+      </w:pPr>
+      <w:r>
+        <w:rPr>
+          <w:b/>
+        </w:rPr>
+        <w:t>Scientific reporting:</w:t>
+      </w:r>
+      <w:r>
+        <w:t xml:space="preserve"> Prepared internal research reports, contributed to manuscript writing, and provided analytical support for high-impact publications.</w:t>
+      </w:r>
+    </w:p>
+    <w:p>
+      <w:pPr>
+        <w:pStyle w:val="ListBullet"/>
+        <w:jc w:val="both"/>
+      </w:pPr>
+      <w:r>
+        <w:rPr>
+          <w:b/>
+        </w:rPr>
+        <w:t>Presentation &amp; outreach:</w:t>
+      </w:r>
+      <w:r>
+        <w:t xml:space="preserve"> Delivered oral and poster presentations at national and international conferences and participated in science communication initiatives.</w:t>
       </w:r>
     </w:p>
     <w:p>
       <w:pPr>
         <w:pStyle w:val="Heading1"/>
-      </w:pPr>
-      <w:r>
-        <w:t xml:space="preserve"> Career Summary</w:t>
-      </w:r>
-    </w:p>
-    <w:p>
-      <w:pPr/>
-      <w:r>
-        <w:t>Experienced Bioinformatician and Molecular Biologist seeking new challenges to apply and expand my expertise in computational biology, data science, and molecular research. Over the past several years, I have contributed to diverse research projects utilizing modern genomic technologies (NGS), advanced data analysis, and data science methodologies to generate novel biological insights that have resulted in high-impact peer-reviewed scientific publications.</w:t>
-      </w:r>
-    </w:p>
-    <w:p>
-      <w:pPr>
-        <w:pStyle w:val="Heading1"/>
-      </w:pPr>
-      <w:r>
-        <w:t xml:space="preserve"> Research Experience</w:t>
+        <w:jc w:val="both"/>
+      </w:pPr>
+      <w:r>
+        <w:t>Education</w:t>
       </w:r>
     </w:p>
     <w:p>
       <w:pPr>
         <w:pStyle w:val="Heading2"/>
-      </w:pPr>
-      <w:r>
-        <w:t>Graduate Research Assistant (Bioinformatics &amp; Molecular Biology) | Institute of Biotechnology, UNAM</w:t>
+        <w:jc w:val="both"/>
+      </w:pPr>
+      <w:r>
+        <w:t xml:space="preserve">Ph.D. in </w:t>
+      </w:r>
+      <w:r>
+        <w:t>Biochemistry</w:t>
+      </w:r>
+      <w:r>
+        <w:t>| National Autonomous University of Mexico (UNAM) | Mexico</w:t>
+      </w:r>
+      <w:r>
         <w:tab/>
-        <w:t>January 2019 - July 2025</w:t>
-      </w:r>
-    </w:p>
-    <w:p>
-      <w:pPr/>
-      <w:r>
-        <w:t>Across several interdisciplinary research projects, I contributed to data acquisition, computational analysis, and dissemination of scientific results. My responsibilities included:</w:t>
-      </w:r>
-    </w:p>
-    <w:p>
-      <w:pPr>
-        <w:pStyle w:val="ListBullet"/>
-      </w:pPr>
-      <w:r/>
-      <w:r>
-        <w:rPr>
-          <w:b/>
-        </w:rPr>
-        <w:t>Project conceptualization:</w:t>
-      </w:r>
-      <w:r>
-        <w:t xml:space="preserve"> Assisted in defining research goals, experimental design, analytical workflows, and computational strategies to address multi-omics biological questions.</w:t>
-      </w:r>
-    </w:p>
-    <w:p>
-      <w:pPr>
-        <w:pStyle w:val="ListBullet"/>
-      </w:pPr>
-      <w:r/>
-      <w:r>
-        <w:rPr>
-          <w:b/>
-        </w:rPr>
-        <w:t>HPC system administration:</w:t>
-      </w:r>
-      <w:r>
-        <w:t xml:space="preserve"> Maintained laboratory computational infrastructure, including Linux installation, software configuration, performance optimization, and data security practices.</w:t>
-      </w:r>
-    </w:p>
-    <w:p>
-      <w:pPr>
-        <w:pStyle w:val="ListBullet"/>
-      </w:pPr>
-      <w:r/>
-      <w:r>
-        <w:rPr>
-          <w:b/>
-        </w:rPr>
-        <w:t>Reproducible workflow engineering:</w:t>
-      </w:r>
-      <w:r>
-        <w:t xml:space="preserve"> Built robust, scalable, and reproducible pipelines using Snakemake, Python, Bash, and Rabix Composer to automate NGS and metagenomic analyses.</w:t>
-      </w:r>
-    </w:p>
-    <w:p>
-      <w:pPr>
-        <w:pStyle w:val="ListBullet"/>
-      </w:pPr>
-      <w:r/>
-      <w:r>
-        <w:rPr>
-          <w:b/>
-        </w:rPr>
-        <w:t>Custom tool development:</w:t>
-      </w:r>
-      <w:r>
-        <w:t xml:space="preserve"> Implemented specialized algorithms and utilities in Python, R, Bash, and Perl to support complex multi-step analyses.</w:t>
-      </w:r>
-    </w:p>
-    <w:p>
-      <w:pPr>
-        <w:pStyle w:val="ListBullet"/>
-      </w:pPr>
-      <w:r/>
-      <w:r>
-        <w:rPr>
-          <w:b/>
-        </w:rPr>
-        <w:t>Quantitative data visualization:</w:t>
-      </w:r>
-      <w:r>
-        <w:t xml:space="preserve"> Designed comprehensive visualizations and figure panels using ggplot2, seaborn, matplotlib, and Jupyter Notebooks.</w:t>
-      </w:r>
-    </w:p>
-    <w:p>
-      <w:pPr>
-        <w:pStyle w:val="ListBullet"/>
-      </w:pPr>
-      <w:r/>
-      <w:r>
-        <w:rPr>
-          <w:b/>
-        </w:rPr>
-        <w:t>Computational best practices:</w:t>
-      </w:r>
-      <w:r>
-        <w:t xml:space="preserve"> Maintained version control through GitHub repositories and incorporated CI/CD testing to ensure workflow reliability.</w:t>
-      </w:r>
-    </w:p>
-    <w:p>
-      <w:pPr>
-        <w:pStyle w:val="ListBullet"/>
-      </w:pPr>
-      <w:r/>
-      <w:r>
-        <w:rPr>
-          <w:b/>
-        </w:rPr>
-        <w:t>Scientific reporting:</w:t>
-      </w:r>
-      <w:r>
-        <w:t xml:space="preserve"> Prepared internal research reports, contributed to manuscript writing, and provided analytical support for high-impact publications.</w:t>
-      </w:r>
-    </w:p>
-    <w:p>
-      <w:pPr>
-        <w:pStyle w:val="ListBullet"/>
-      </w:pPr>
-      <w:r/>
-      <w:r>
-        <w:rPr>
-          <w:b/>
-        </w:rPr>
-        <w:t>Presentation &amp; outreach:</w:t>
-      </w:r>
-      <w:r>
-        <w:t xml:space="preserve"> Delivered oral and poster presentations at national and international conferences and participated in science communication initiatives.</w:t>
-      </w:r>
-    </w:p>
-    <w:p>
-      <w:pPr>
-        <w:pStyle w:val="Heading1"/>
-      </w:pPr>
-      <w:r>
-        <w:t xml:space="preserve"> Education</w:t>
+        <w:t xml:space="preserve">January 2019 </w:t>
+      </w:r>
+      <w:r>
+        <w:t>–</w:t>
+      </w:r>
+      <w:r>
+        <w:t xml:space="preserve"> July 2025</w:t>
       </w:r>
     </w:p>
     <w:p>
       <w:pPr>
         <w:pStyle w:val="Heading2"/>
-      </w:pPr>
-      <w:r>
-        <w:t>Ph.D. in Computational Biology | National Autonomous University of Mexico (UNAM) | Mexico City, Mexico</w:t>
-        <w:tab/>
-        <w:t>January 2019 - July 2025</w:t>
-      </w:r>
-    </w:p>
-    <w:p>
-      <w:pPr>
-        <w:pStyle w:val="Heading2"/>
-      </w:pPr>
-      <w:r>
-        <w:t>Master of Science in Computational Biology | National Autonomous University of Mexico (UNAM) | Mexico City, Mexico</w:t>
+        <w:jc w:val="both"/>
+      </w:pPr>
+      <w:r>
+        <w:t>Master of Science</w:t>
+      </w:r>
+      <w:r>
+        <w:t xml:space="preserve"> in Biochemistry</w:t>
+      </w:r>
+      <w:r>
+        <w:t xml:space="preserve"> | National Autonomous University of Mexico (UNAM) |</w:t>
+      </w:r>
+      <w:r>
+        <w:t xml:space="preserve"> </w:t>
+      </w:r>
+      <w:r>
+        <w:t>Mexico</w:t>
+      </w:r>
+      <w:r>
         <w:tab/>
         <w:t>August 2016 - January 2019</w:t>
       </w:r>
@@ -209,9 +501,12 @@
     <w:p>
       <w:pPr>
         <w:pStyle w:val="Heading2"/>
-      </w:pPr>
-      <w:r>
-        <w:t>Bachelor of Science in Molecular Biology | University of Guadalajara (UDG) | Guadalajara, Mexico</w:t>
+        <w:jc w:val="both"/>
+      </w:pPr>
+      <w:r>
+        <w:t>Bachelor of Science in Biology | University of Guadalajara (UDG) | Guadalajara, Mexico</w:t>
+      </w:r>
+      <w:r>
         <w:tab/>
         <w:t>August 2012 - January 2016</w:t>
       </w:r>
@@ -219,38 +514,133 @@
     <w:p>
       <w:pPr>
         <w:pStyle w:val="Heading1"/>
-      </w:pPr>
-      <w:r>
-        <w:t xml:space="preserve"> Teaching Experience</w:t>
+        <w:jc w:val="both"/>
+      </w:pPr>
+      <w:r>
+        <w:t>Teaching Experience</w:t>
       </w:r>
     </w:p>
     <w:p>
       <w:pPr>
         <w:pStyle w:val="ListBullet"/>
-      </w:pPr>
-      <w:r>
-        <w:t>Guest lecturer at Universidad de La Sabana (Chia, Colombia). December 2023.</w:t>
+        <w:jc w:val="both"/>
+      </w:pPr>
+      <w:r>
+        <w:t>Organizer and instructor of the "</w:t>
+      </w:r>
+      <w:proofErr w:type="spellStart"/>
+      <w:r>
+        <w:t>Bioinfo</w:t>
+      </w:r>
+      <w:proofErr w:type="spellEnd"/>
+      <w:r>
+        <w:t xml:space="preserve"> del Norte" bioinformatics and metagenomics training event, CIAD, Hermosillo, Sonora. September 2024.</w:t>
       </w:r>
     </w:p>
     <w:p>
       <w:pPr>
         <w:pStyle w:val="ListBullet"/>
-      </w:pPr>
-      <w:r>
-        <w:t>Organizer and instructor of the "Bioinfo del Norte" bioinformatics and metagenomics training event, CIAD, Hermosillo, Sonora. September 2024.</w:t>
+        <w:jc w:val="both"/>
+        <w:rPr>
+          <w:lang w:val="es-ES"/>
+        </w:rPr>
+      </w:pPr>
+      <w:r>
+        <w:rPr>
+          <w:lang w:val="es-ES"/>
+        </w:rPr>
+        <w:t xml:space="preserve">Guest </w:t>
+      </w:r>
+      <w:proofErr w:type="spellStart"/>
+      <w:r>
+        <w:rPr>
+          <w:lang w:val="es-ES"/>
+        </w:rPr>
+        <w:t>lecturer</w:t>
+      </w:r>
+      <w:proofErr w:type="spellEnd"/>
+      <w:r>
+        <w:rPr>
+          <w:lang w:val="es-ES"/>
+        </w:rPr>
+        <w:t xml:space="preserve"> at Universidad de La Sabana (Chia, Colombia). December 2023.</w:t>
       </w:r>
     </w:p>
     <w:p>
       <w:pPr>
         <w:pStyle w:val="ListBullet"/>
-      </w:pPr>
-      <w:r>
-        <w:t>Microbiota Symposium from Theory to Clinical Practice, Colegio de Profesionales de la Nutrición de Querétaro y el Bajío. June 2021.</w:t>
+        <w:jc w:val="both"/>
+        <w:rPr>
+          <w:lang w:val="es-ES"/>
+        </w:rPr>
+      </w:pPr>
+      <w:r>
+        <w:rPr>
+          <w:lang w:val="es-ES"/>
+        </w:rPr>
+        <w:t xml:space="preserve">Microbiota </w:t>
+      </w:r>
+      <w:proofErr w:type="spellStart"/>
+      <w:r>
+        <w:rPr>
+          <w:lang w:val="es-ES"/>
+        </w:rPr>
+        <w:t>Symposium</w:t>
+      </w:r>
+      <w:proofErr w:type="spellEnd"/>
+      <w:r>
+        <w:rPr>
+          <w:lang w:val="es-ES"/>
+        </w:rPr>
+        <w:t xml:space="preserve"> </w:t>
+      </w:r>
+      <w:proofErr w:type="spellStart"/>
+      <w:r>
+        <w:rPr>
+          <w:lang w:val="es-ES"/>
+        </w:rPr>
+        <w:t>from</w:t>
+      </w:r>
+      <w:proofErr w:type="spellEnd"/>
+      <w:r>
+        <w:rPr>
+          <w:lang w:val="es-ES"/>
+        </w:rPr>
+        <w:t xml:space="preserve"> Theory to </w:t>
+      </w:r>
+      <w:proofErr w:type="spellStart"/>
+      <w:r>
+        <w:rPr>
+          <w:lang w:val="es-ES"/>
+        </w:rPr>
+        <w:t>Clinical</w:t>
+      </w:r>
+      <w:proofErr w:type="spellEnd"/>
+      <w:r>
+        <w:rPr>
+          <w:lang w:val="es-ES"/>
+        </w:rPr>
+        <w:t xml:space="preserve"> </w:t>
+      </w:r>
+      <w:proofErr w:type="spellStart"/>
+      <w:r>
+        <w:rPr>
+          <w:lang w:val="es-ES"/>
+        </w:rPr>
+        <w:t>Practice</w:t>
+      </w:r>
+      <w:proofErr w:type="spellEnd"/>
+      <w:r>
+        <w:rPr>
+          <w:lang w:val="es-ES"/>
+        </w:rPr>
+        <w:t>, Colegio de Profesionales de la Nutrición de Querétaro y el Bajío. June 2021.</w:t>
       </w:r>
     </w:p>
     <w:p>
       <w:pPr>
         <w:pStyle w:val="ListBullet"/>
+        <w:jc w:val="both"/>
       </w:pPr>
       <w:r>
         <w:t>Bioinformatics and Reproducible Research Workshop, Postgraduate Program in Biological Sciences, UNAM. October 2019.</w:t>
@@ -259,6 +649,7 @@
     <w:p>
       <w:pPr>
         <w:pStyle w:val="ListBullet"/>
+        <w:jc w:val="both"/>
       </w:pPr>
       <w:r>
         <w:t>Guest lecturer at Center of Genomic Sciences, UNAM. August 2018.</w:t>
@@ -267,45 +658,106 @@
     <w:p>
       <w:pPr>
         <w:pStyle w:val="Heading1"/>
-      </w:pPr>
-      <w:r>
-        <w:t xml:space="preserve"> Directed Theses</w:t>
-      </w:r>
-    </w:p>
-    <w:p>
-      <w:pPr/>
-      <w:r>
-        <w:t>Bachelor's Thesis: Itzel Abigail Hernández Reyna, Bachelor's in Nutrition (Universidad Autónoma del Estado de Morelos), December 2019. "Impact of bacteriophages associated with childhood obesity on the intestinal metagenome."</w:t>
-      </w:r>
+        <w:jc w:val="both"/>
+      </w:pPr>
+      <w:r>
+        <w:t>Directed Theses</w:t>
+      </w:r>
+    </w:p>
+    <w:p>
+      <w:pPr>
+        <w:jc w:val="both"/>
+      </w:pPr>
+      <w:r>
+        <w:t xml:space="preserve">Bachelor's Thesis: Itzel Abigail Hernández Reyna, </w:t>
+      </w:r>
+      <w:proofErr w:type="gramStart"/>
+      <w:r>
+        <w:t>Bachelor's in Nutrition</w:t>
+      </w:r>
+      <w:proofErr w:type="gramEnd"/>
+      <w:r>
+        <w:t xml:space="preserve"> (Universidad </w:t>
+      </w:r>
+      <w:proofErr w:type="spellStart"/>
+      <w:r>
+        <w:t>Autónoma</w:t>
+      </w:r>
+      <w:proofErr w:type="spellEnd"/>
+      <w:r>
+        <w:t xml:space="preserve"> del Estado de Morelos), December 2019. "Impact of bacteriophages associated with childhood obesity on the intestinal metagenome."</w:t>
+      </w:r>
+    </w:p>
+    <w:p>
+      <w:pPr>
+        <w:spacing w:before="0"/>
+      </w:pPr>
+      <w:r>
+        <w:br w:type="page"/>
+      </w:r>
+    </w:p>
+    <w:p>
+      <w:pPr>
+        <w:jc w:val="both"/>
+      </w:pPr>
     </w:p>
     <w:p>
       <w:pPr>
         <w:pStyle w:val="Heading1"/>
-      </w:pPr>
-      <w:r>
-        <w:t xml:space="preserve"> Soft Skills</w:t>
-      </w:r>
-    </w:p>
-    <w:p>
-      <w:pPr/>
+        <w:jc w:val="both"/>
+      </w:pPr>
+      <w:r>
+        <w:t>Soft Skills</w:t>
+      </w:r>
+    </w:p>
+    <w:p>
+      <w:pPr>
+        <w:pStyle w:val="ListParagraph"/>
+        <w:numPr>
+          <w:ilvl w:val="0"/>
+          <w:numId w:val="4"/>
+        </w:numPr>
+        <w:jc w:val="both"/>
+      </w:pPr>
       <w:r>
         <w:t>Adaptable and quick to learn new technologies, analytical methods, and computational tools.</w:t>
       </w:r>
     </w:p>
     <w:p>
-      <w:pPr/>
+      <w:pPr>
+        <w:pStyle w:val="ListParagraph"/>
+        <w:numPr>
+          <w:ilvl w:val="0"/>
+          <w:numId w:val="4"/>
+        </w:numPr>
+        <w:jc w:val="both"/>
+      </w:pPr>
       <w:r>
         <w:t>Strong problem-solving skills with the ability to manage multiple complex projects while maintaining high-quality output.</w:t>
       </w:r>
     </w:p>
     <w:p>
-      <w:pPr/>
+      <w:pPr>
+        <w:pStyle w:val="ListParagraph"/>
+        <w:numPr>
+          <w:ilvl w:val="0"/>
+          <w:numId w:val="4"/>
+        </w:numPr>
+        <w:jc w:val="both"/>
+      </w:pPr>
       <w:r>
         <w:t>Effective communicator with experience collaborating in interdisciplinary teams as well as working independently.</w:t>
       </w:r>
     </w:p>
     <w:p>
-      <w:pPr/>
+      <w:pPr>
+        <w:pStyle w:val="ListParagraph"/>
+        <w:numPr>
+          <w:ilvl w:val="0"/>
+          <w:numId w:val="4"/>
+        </w:numPr>
+        <w:jc w:val="both"/>
+      </w:pPr>
       <w:r>
         <w:t>Skilled in technical operations including server maintenance, Git/GitHub workflows, and development of automated scripts for research tasks.</w:t>
       </w:r>
@@ -313,14 +765,16 @@
     <w:p>
       <w:pPr>
         <w:pStyle w:val="Heading1"/>
-      </w:pPr>
-      <w:r>
-        <w:t xml:space="preserve"> Programming Languages, Tools, Bioinformatics &amp; Molecular Biology Skills</w:t>
-      </w:r>
-    </w:p>
-    <w:p>
-      <w:pPr/>
-      <w:r/>
+        <w:jc w:val="both"/>
+      </w:pPr>
+      <w:r>
+        <w:t>Programming Languages, Tools, Bioinformatics &amp; Molecular Biology Skills</w:t>
+      </w:r>
+    </w:p>
+    <w:p>
+      <w:pPr>
+        <w:jc w:val="both"/>
+      </w:pPr>
       <w:r>
         <w:rPr>
           <w:b/>
@@ -332,8 +786,9 @@
       </w:r>
     </w:p>
     <w:p>
-      <w:pPr/>
-      <w:r/>
+      <w:pPr>
+        <w:jc w:val="both"/>
+      </w:pPr>
       <w:r>
         <w:rPr>
           <w:b/>
@@ -341,12 +796,51 @@
         <w:t>Bioinformatics Tools &amp; Methods:</w:t>
       </w:r>
       <w:r>
-        <w:t xml:space="preserve"> Snakemake, Nextflow, QIIME2, Trinity, SPAdes, Bowtie2, BWA, HISAT2, samtools, fastp, Kraken2</w:t>
-      </w:r>
-    </w:p>
-    <w:p>
-      <w:pPr/>
-      <w:r/>
+        <w:t xml:space="preserve"> </w:t>
+      </w:r>
+      <w:proofErr w:type="spellStart"/>
+      <w:r>
+        <w:t>Snakemake</w:t>
+      </w:r>
+      <w:proofErr w:type="spellEnd"/>
+      <w:r>
+        <w:t xml:space="preserve">, </w:t>
+      </w:r>
+      <w:proofErr w:type="spellStart"/>
+      <w:r>
+        <w:t>Nextflow</w:t>
+      </w:r>
+      <w:proofErr w:type="spellEnd"/>
+      <w:r>
+        <w:t xml:space="preserve">, QIIME2, Trinity, </w:t>
+      </w:r>
+      <w:proofErr w:type="spellStart"/>
+      <w:r>
+        <w:t>SPAdes</w:t>
+      </w:r>
+      <w:proofErr w:type="spellEnd"/>
+      <w:r>
+        <w:t xml:space="preserve">, Bowtie2, BWA, HISAT2, </w:t>
+      </w:r>
+      <w:proofErr w:type="spellStart"/>
+      <w:r>
+        <w:t>samtools</w:t>
+      </w:r>
+      <w:proofErr w:type="spellEnd"/>
+      <w:r>
+        <w:t xml:space="preserve">, </w:t>
+      </w:r>
+      <w:r>
+        <w:t>Spades</w:t>
+      </w:r>
+      <w:r>
+        <w:t>, Kraken2</w:t>
+      </w:r>
+    </w:p>
+    <w:p>
+      <w:pPr>
+        <w:jc w:val="both"/>
+      </w:pPr>
       <w:r>
         <w:rPr>
           <w:b/>
@@ -358,8 +852,9 @@
       </w:r>
     </w:p>
     <w:p>
-      <w:pPr/>
-      <w:r/>
+      <w:pPr>
+        <w:jc w:val="both"/>
+      </w:pPr>
       <w:r>
         <w:rPr>
           <w:b/>
@@ -371,8 +866,9 @@
       </w:r>
     </w:p>
     <w:p>
-      <w:pPr/>
-      <w:r/>
+      <w:pPr>
+        <w:jc w:val="both"/>
+      </w:pPr>
       <w:r>
         <w:rPr>
           <w:b/>
@@ -384,8 +880,9 @@
       </w:r>
     </w:p>
     <w:p>
-      <w:pPr/>
-      <w:r/>
+      <w:pPr>
+        <w:jc w:val="both"/>
+      </w:pPr>
       <w:r>
         <w:rPr>
           <w:b/>
@@ -397,8 +894,9 @@
       </w:r>
     </w:p>
     <w:p>
-      <w:pPr/>
-      <w:r/>
+      <w:pPr>
+        <w:jc w:val="both"/>
+      </w:pPr>
       <w:r>
         <w:rPr>
           <w:b/>
@@ -410,8 +908,9 @@
       </w:r>
     </w:p>
     <w:p>
-      <w:pPr/>
-      <w:r/>
+      <w:pPr>
+        <w:jc w:val="both"/>
+      </w:pPr>
       <w:r>
         <w:rPr>
           <w:b/>
@@ -419,12 +918,21 @@
         <w:t>Data Science &amp; Visualization:</w:t>
       </w:r>
       <w:r>
-        <w:t xml:space="preserve"> ggplot2, seaborn, matplotlib, Jupyter Notebooks, RStudio</w:t>
-      </w:r>
-    </w:p>
-    <w:p>
-      <w:pPr/>
-      <w:r/>
+        <w:t xml:space="preserve"> ggplot2, seaborn, matplotlib, </w:t>
+      </w:r>
+      <w:proofErr w:type="spellStart"/>
+      <w:r>
+        <w:t>Jupyter</w:t>
+      </w:r>
+      <w:proofErr w:type="spellEnd"/>
+      <w:r>
+        <w:t xml:space="preserve"> Notebooks, RStudio</w:t>
+      </w:r>
+    </w:p>
+    <w:p>
+      <w:pPr>
+        <w:jc w:val="both"/>
+      </w:pPr>
       <w:r>
         <w:rPr>
           <w:b/>
@@ -438,19 +946,24 @@
     <w:p>
       <w:pPr>
         <w:pStyle w:val="Heading1"/>
-      </w:pPr>
-      <w:r>
-        <w:t xml:space="preserve"> Languages</w:t>
-      </w:r>
-    </w:p>
-    <w:p>
-      <w:pPr/>
+        <w:jc w:val="both"/>
+      </w:pPr>
+      <w:r>
+        <w:t>Languages</w:t>
+      </w:r>
+    </w:p>
+    <w:p>
+      <w:pPr>
+        <w:jc w:val="both"/>
+      </w:pPr>
       <w:r>
         <w:t>English – Full professional proficiency</w:t>
       </w:r>
     </w:p>
     <w:p>
-      <w:pPr/>
+      <w:pPr>
+        <w:jc w:val="both"/>
+      </w:pPr>
       <w:r>
         <w:t>Spanish – Native</w:t>
       </w:r>
@@ -458,129 +971,940 @@
     <w:p>
       <w:pPr>
         <w:pStyle w:val="Heading1"/>
-      </w:pPr>
-      <w:r>
-        <w:t xml:space="preserve"> Publications</w:t>
+        <w:jc w:val="both"/>
+      </w:pPr>
+      <w:r>
+        <w:t>Publications</w:t>
       </w:r>
     </w:p>
     <w:p>
       <w:pPr>
         <w:pStyle w:val="ListBullet"/>
-      </w:pPr>
-      <w:r>
-        <w:t xml:space="preserve">Jatuyosporn T, Laohawutthichai P, Cornejo-Granados F, </w:t>
+        <w:numPr>
+          <w:ilvl w:val="0"/>
+          <w:numId w:val="3"/>
+        </w:numPr>
+        <w:jc w:val="both"/>
+        <w:rPr>
+          <w:lang w:val="es-ES"/>
+        </w:rPr>
+      </w:pPr>
+      <w:proofErr w:type="spellStart"/>
+      <w:r>
+        <w:t>Jatuyosporn</w:t>
+      </w:r>
+      <w:proofErr w:type="spellEnd"/>
+      <w:r>
+        <w:t xml:space="preserve"> T, </w:t>
+      </w:r>
+      <w:proofErr w:type="spellStart"/>
+      <w:r>
+        <w:t>Laohawutthichai</w:t>
+      </w:r>
+      <w:proofErr w:type="spellEnd"/>
+      <w:r>
+        <w:t xml:space="preserve"> P, Cornejo-Granados F, </w:t>
       </w:r>
       <w:r>
         <w:rPr>
           <w:b/>
+          <w:bCs/>
         </w:rPr>
         <w:t>Gallardo-Becerra L</w:t>
       </w:r>
       <w:r>
-        <w:t>, Tassanakajon A, Hurtado-Ramírez JM, Ochoa-Leyva A, Krusong K. *De novo* transcriptome assembly and annotation of *Penaeus monodon* hemocytes under WSSV infection and STAT knockdown. Sci Data. 2026.</w:t>
+        <w:t xml:space="preserve">, </w:t>
+      </w:r>
+      <w:proofErr w:type="spellStart"/>
+      <w:r>
+        <w:t>Tassanakajon</w:t>
+      </w:r>
+      <w:proofErr w:type="spellEnd"/>
+      <w:r>
+        <w:t xml:space="preserve"> A, Hurtado-Ramírez JM, Ochoa-Leyva A, </w:t>
+      </w:r>
+      <w:proofErr w:type="spellStart"/>
+      <w:r>
+        <w:t>Krusong</w:t>
+      </w:r>
+      <w:proofErr w:type="spellEnd"/>
+      <w:r>
+        <w:t xml:space="preserve"> K. </w:t>
+      </w:r>
+      <w:r>
+        <w:rPr>
+          <w:i/>
+          <w:iCs/>
+        </w:rPr>
+        <w:t>De novo</w:t>
+      </w:r>
+      <w:r>
+        <w:t xml:space="preserve"> transcriptome assembly and annotation of </w:t>
+      </w:r>
+      <w:r>
+        <w:rPr>
+          <w:i/>
+          <w:iCs/>
+        </w:rPr>
+        <w:t>Penaeus monodon</w:t>
+      </w:r>
+      <w:r>
+        <w:t xml:space="preserve"> hemocytes under WSSV infection and STAT knockdown. </w:t>
+      </w:r>
+      <w:proofErr w:type="spellStart"/>
+      <w:r>
+        <w:rPr>
+          <w:lang w:val="es-ES"/>
+        </w:rPr>
+        <w:t>Sci</w:t>
+      </w:r>
+      <w:proofErr w:type="spellEnd"/>
+      <w:r>
+        <w:rPr>
+          <w:lang w:val="es-ES"/>
+        </w:rPr>
+        <w:t xml:space="preserve"> Data. 2026.</w:t>
       </w:r>
     </w:p>
     <w:p>
       <w:pPr>
         <w:pStyle w:val="ListBullet"/>
-      </w:pPr>
-      <w:r/>
+        <w:numPr>
+          <w:ilvl w:val="0"/>
+          <w:numId w:val="3"/>
+        </w:numPr>
+        <w:jc w:val="both"/>
+        <w:rPr>
+          <w:lang w:val="es-ES"/>
+        </w:rPr>
+      </w:pPr>
       <w:r>
         <w:rPr>
           <w:b/>
+          <w:bCs/>
+          <w:lang w:val="es-ES"/>
         </w:rPr>
         <w:t>Gallardo-Becerra L</w:t>
       </w:r>
       <w:r>
-        <w:t>, Cornejo-Granados F, Bikel S, Arenas I, López-Leal G, Alvarado-Gonzalez C, Sánchez-López F, Manzo R, Corzo G, Espino-Solis GP, Canizales-Quinteros S, Ochoa-Leyva A. Bioactive plasmid- and phage-encoded antimicrobial peptides (AMPs) in the human gut: a metatranscriptome–virome profiling reveals exploratory links to metabolic human diseases. Microb Ecol. 2025 Nov 28.</w:t>
+        <w:rPr>
+          <w:lang w:val="es-ES"/>
+        </w:rPr>
+        <w:t>, Cornejo-Granados F, Bikel S, Arenas I, López-Leal G, Alvarado-</w:t>
+      </w:r>
+      <w:proofErr w:type="spellStart"/>
+      <w:r>
+        <w:rPr>
+          <w:lang w:val="es-ES"/>
+        </w:rPr>
+        <w:t>Gonzalez</w:t>
+      </w:r>
+      <w:proofErr w:type="spellEnd"/>
+      <w:r>
+        <w:rPr>
+          <w:lang w:val="es-ES"/>
+        </w:rPr>
+        <w:t xml:space="preserve"> C, Sánchez-López F, Manzo R, Corzo G, Espino-Solis GP, Canizales-Quinteros S, Ochoa-Leyva A. Bioactive </w:t>
+      </w:r>
+      <w:proofErr w:type="spellStart"/>
+      <w:r>
+        <w:rPr>
+          <w:lang w:val="es-ES"/>
+        </w:rPr>
+        <w:t>plasmid</w:t>
+      </w:r>
+      <w:proofErr w:type="spellEnd"/>
+      <w:r>
+        <w:rPr>
+          <w:lang w:val="es-ES"/>
+        </w:rPr>
+        <w:t xml:space="preserve">- and phage-encoded </w:t>
+      </w:r>
+      <w:proofErr w:type="spellStart"/>
+      <w:r>
+        <w:rPr>
+          <w:lang w:val="es-ES"/>
+        </w:rPr>
+        <w:t>antimicrobial</w:t>
+      </w:r>
+      <w:proofErr w:type="spellEnd"/>
+      <w:r>
+        <w:rPr>
+          <w:lang w:val="es-ES"/>
+        </w:rPr>
+        <w:t xml:space="preserve"> </w:t>
+      </w:r>
+      <w:proofErr w:type="spellStart"/>
+      <w:r>
+        <w:rPr>
+          <w:lang w:val="es-ES"/>
+        </w:rPr>
+        <w:t>peptides</w:t>
+      </w:r>
+      <w:proofErr w:type="spellEnd"/>
+      <w:r>
+        <w:rPr>
+          <w:lang w:val="es-ES"/>
+        </w:rPr>
+        <w:t xml:space="preserve"> (AMPs) in the human gut: a metatranscriptome–virome profiling </w:t>
+      </w:r>
+      <w:proofErr w:type="spellStart"/>
+      <w:r>
+        <w:rPr>
+          <w:lang w:val="es-ES"/>
+        </w:rPr>
+        <w:t>reveals</w:t>
+      </w:r>
+      <w:proofErr w:type="spellEnd"/>
+      <w:r>
+        <w:rPr>
+          <w:lang w:val="es-ES"/>
+        </w:rPr>
+        <w:t xml:space="preserve"> </w:t>
+      </w:r>
+      <w:proofErr w:type="spellStart"/>
+      <w:r>
+        <w:rPr>
+          <w:lang w:val="es-ES"/>
+        </w:rPr>
+        <w:t>exploratory</w:t>
+      </w:r>
+      <w:proofErr w:type="spellEnd"/>
+      <w:r>
+        <w:rPr>
+          <w:lang w:val="es-ES"/>
+        </w:rPr>
+        <w:t xml:space="preserve"> links to metabolic human </w:t>
+      </w:r>
+      <w:proofErr w:type="spellStart"/>
+      <w:r>
+        <w:rPr>
+          <w:lang w:val="es-ES"/>
+        </w:rPr>
+        <w:t>diseases</w:t>
+      </w:r>
+      <w:proofErr w:type="spellEnd"/>
+      <w:r>
+        <w:rPr>
+          <w:lang w:val="es-ES"/>
+        </w:rPr>
+        <w:t>. Microb Ecol. 2025 Nov 28.</w:t>
       </w:r>
     </w:p>
     <w:p>
       <w:pPr>
         <w:pStyle w:val="ListBullet"/>
-      </w:pPr>
-      <w:r>
+        <w:numPr>
+          <w:ilvl w:val="0"/>
+          <w:numId w:val="3"/>
+        </w:numPr>
+        <w:jc w:val="both"/>
+        <w:rPr>
+          <w:bCs/>
+          <w:lang w:val="es-ES"/>
+        </w:rPr>
+      </w:pPr>
+      <w:r>
+        <w:rPr>
+          <w:bCs/>
+          <w:lang w:val="es-ES"/>
+        </w:rPr>
         <w:t xml:space="preserve">Cornejo-Granados F, </w:t>
       </w:r>
       <w:r>
         <w:rPr>
           <w:b/>
+          <w:lang w:val="es-ES"/>
         </w:rPr>
         <w:t>Gallardo-Becerra L</w:t>
       </w:r>
       <w:r>
-        <w:t>, Romero-Hidalgo S, Lopez-Zavala AA, Cota-Huízar A, Cervantes-Echeverría M, Sotelo-Mundo RR, Ochoa-Leyva A. Host genome drives the microbiota enrichment of beneficial microbes in shrimp: exploring the hologenome perspective. Animal Microbiome. 2025 May 22;7(1):50.</w:t>
+        <w:rPr>
+          <w:bCs/>
+          <w:lang w:val="es-ES"/>
+        </w:rPr>
+        <w:t xml:space="preserve">, Romero-Hidalgo S, </w:t>
+      </w:r>
+      <w:proofErr w:type="spellStart"/>
+      <w:r>
+        <w:rPr>
+          <w:bCs/>
+          <w:lang w:val="es-ES"/>
+        </w:rPr>
+        <w:t>Lopez</w:t>
+      </w:r>
+      <w:proofErr w:type="spellEnd"/>
+      <w:r>
+        <w:rPr>
+          <w:bCs/>
+          <w:lang w:val="es-ES"/>
+        </w:rPr>
+        <w:t>-Zavala AA, Cota-</w:t>
+      </w:r>
+      <w:proofErr w:type="spellStart"/>
+      <w:r>
+        <w:rPr>
+          <w:bCs/>
+          <w:lang w:val="es-ES"/>
+        </w:rPr>
+        <w:t>Huízar</w:t>
+      </w:r>
+      <w:proofErr w:type="spellEnd"/>
+      <w:r>
+        <w:rPr>
+          <w:bCs/>
+          <w:lang w:val="es-ES"/>
+        </w:rPr>
+        <w:t xml:space="preserve"> A, Cervantes-Echeverría M, Sotelo-Mundo RR, Ochoa-Leyva A. Host </w:t>
+      </w:r>
+      <w:proofErr w:type="spellStart"/>
+      <w:r>
+        <w:rPr>
+          <w:bCs/>
+          <w:lang w:val="es-ES"/>
+        </w:rPr>
+        <w:t>genome</w:t>
+      </w:r>
+      <w:proofErr w:type="spellEnd"/>
+      <w:r>
+        <w:rPr>
+          <w:bCs/>
+          <w:lang w:val="es-ES"/>
+        </w:rPr>
+        <w:t xml:space="preserve"> drives the microbiota </w:t>
+      </w:r>
+      <w:proofErr w:type="spellStart"/>
+      <w:r>
+        <w:rPr>
+          <w:bCs/>
+          <w:lang w:val="es-ES"/>
+        </w:rPr>
+        <w:t>enrichment</w:t>
+      </w:r>
+      <w:proofErr w:type="spellEnd"/>
+      <w:r>
+        <w:rPr>
+          <w:bCs/>
+          <w:lang w:val="es-ES"/>
+        </w:rPr>
+        <w:t xml:space="preserve"> of beneficial </w:t>
+      </w:r>
+      <w:proofErr w:type="spellStart"/>
+      <w:r>
+        <w:rPr>
+          <w:bCs/>
+          <w:lang w:val="es-ES"/>
+        </w:rPr>
+        <w:t>microbes</w:t>
+      </w:r>
+      <w:proofErr w:type="spellEnd"/>
+      <w:r>
+        <w:rPr>
+          <w:bCs/>
+          <w:lang w:val="es-ES"/>
+        </w:rPr>
+        <w:t xml:space="preserve"> in </w:t>
+      </w:r>
+      <w:proofErr w:type="spellStart"/>
+      <w:r>
+        <w:rPr>
+          <w:bCs/>
+          <w:lang w:val="es-ES"/>
+        </w:rPr>
+        <w:t>shrimp</w:t>
+      </w:r>
+      <w:proofErr w:type="spellEnd"/>
+      <w:r>
+        <w:rPr>
+          <w:bCs/>
+          <w:lang w:val="es-ES"/>
+        </w:rPr>
+        <w:t xml:space="preserve">: </w:t>
+      </w:r>
+      <w:proofErr w:type="spellStart"/>
+      <w:r>
+        <w:rPr>
+          <w:bCs/>
+          <w:lang w:val="es-ES"/>
+        </w:rPr>
+        <w:t>exploring</w:t>
+      </w:r>
+      <w:proofErr w:type="spellEnd"/>
+      <w:r>
+        <w:rPr>
+          <w:bCs/>
+          <w:lang w:val="es-ES"/>
+        </w:rPr>
+        <w:t xml:space="preserve"> the hologenome </w:t>
+      </w:r>
+      <w:proofErr w:type="spellStart"/>
+      <w:r>
+        <w:rPr>
+          <w:bCs/>
+          <w:lang w:val="es-ES"/>
+        </w:rPr>
+        <w:t>perspective</w:t>
+      </w:r>
+      <w:proofErr w:type="spellEnd"/>
+      <w:r>
+        <w:rPr>
+          <w:bCs/>
+          <w:lang w:val="es-ES"/>
+        </w:rPr>
+        <w:t>. Animal Microbiome. 2025 May 22;7(1):50.</w:t>
       </w:r>
     </w:p>
     <w:p>
       <w:pPr>
         <w:pStyle w:val="ListBullet"/>
-      </w:pPr>
-      <w:r>
+        <w:numPr>
+          <w:ilvl w:val="0"/>
+          <w:numId w:val="3"/>
+        </w:numPr>
+        <w:jc w:val="both"/>
+        <w:rPr>
+          <w:lang w:val="es-ES"/>
+        </w:rPr>
+      </w:pPr>
+      <w:r>
+        <w:rPr>
+          <w:lang w:val="es-ES"/>
+        </w:rPr>
         <w:t xml:space="preserve">Manzo R, </w:t>
       </w:r>
       <w:r>
         <w:rPr>
           <w:b/>
+          <w:bCs/>
+          <w:lang w:val="es-ES"/>
         </w:rPr>
         <w:t>Gallardo-Becerra L</w:t>
       </w:r>
       <w:r>
-        <w:t>, Díaz de León-Guerrero S, Villaseñor T, Cornejo-Granados F, Salazar-León J, Ochoa-Leyva A, Pedraza-Alva G, Pérez-Martínez L. Environmental Enrichment Prevents Gut Dysbiosis Progression and Enhances Glucose Metabolism in High-Fat Diet-Induced Obese Mice. International Journal of Molecular Sciences. 2024 Jan;25(13):6904.</w:t>
+        <w:rPr>
+          <w:lang w:val="es-ES"/>
+        </w:rPr>
+        <w:t xml:space="preserve">, Díaz de León-Guerrero S, Villaseñor T, Cornejo-Granados F, Salazar-León J, Ochoa-Leyva A, Pedraza-Alva G, Pérez-Martínez L. </w:t>
+      </w:r>
+      <w:proofErr w:type="spellStart"/>
+      <w:r>
+        <w:rPr>
+          <w:lang w:val="es-ES"/>
+        </w:rPr>
+        <w:t>Environmental</w:t>
+      </w:r>
+      <w:proofErr w:type="spellEnd"/>
+      <w:r>
+        <w:rPr>
+          <w:lang w:val="es-ES"/>
+        </w:rPr>
+        <w:t xml:space="preserve"> </w:t>
+      </w:r>
+      <w:proofErr w:type="spellStart"/>
+      <w:r>
+        <w:rPr>
+          <w:lang w:val="es-ES"/>
+        </w:rPr>
+        <w:t>Enrichment</w:t>
+      </w:r>
+      <w:proofErr w:type="spellEnd"/>
+      <w:r>
+        <w:rPr>
+          <w:lang w:val="es-ES"/>
+        </w:rPr>
+        <w:t xml:space="preserve"> </w:t>
+      </w:r>
+      <w:proofErr w:type="spellStart"/>
+      <w:r>
+        <w:rPr>
+          <w:lang w:val="es-ES"/>
+        </w:rPr>
+        <w:t>Prevents</w:t>
+      </w:r>
+      <w:proofErr w:type="spellEnd"/>
+      <w:r>
+        <w:rPr>
+          <w:lang w:val="es-ES"/>
+        </w:rPr>
+        <w:t xml:space="preserve"> Gut </w:t>
+      </w:r>
+      <w:proofErr w:type="spellStart"/>
+      <w:r>
+        <w:rPr>
+          <w:lang w:val="es-ES"/>
+        </w:rPr>
+        <w:t>Dysbiosis</w:t>
+      </w:r>
+      <w:proofErr w:type="spellEnd"/>
+      <w:r>
+        <w:rPr>
+          <w:lang w:val="es-ES"/>
+        </w:rPr>
+        <w:t xml:space="preserve"> </w:t>
+      </w:r>
+      <w:proofErr w:type="spellStart"/>
+      <w:r>
+        <w:rPr>
+          <w:lang w:val="es-ES"/>
+        </w:rPr>
+        <w:t>Progression</w:t>
+      </w:r>
+      <w:proofErr w:type="spellEnd"/>
+      <w:r>
+        <w:rPr>
+          <w:lang w:val="es-ES"/>
+        </w:rPr>
+        <w:t xml:space="preserve"> and </w:t>
+      </w:r>
+      <w:proofErr w:type="spellStart"/>
+      <w:r>
+        <w:rPr>
+          <w:lang w:val="es-ES"/>
+        </w:rPr>
+        <w:t>Enhances</w:t>
+      </w:r>
+      <w:proofErr w:type="spellEnd"/>
+      <w:r>
+        <w:rPr>
+          <w:lang w:val="es-ES"/>
+        </w:rPr>
+        <w:t xml:space="preserve"> </w:t>
+      </w:r>
+      <w:proofErr w:type="spellStart"/>
+      <w:r>
+        <w:rPr>
+          <w:lang w:val="es-ES"/>
+        </w:rPr>
+        <w:t>Glucose</w:t>
+      </w:r>
+      <w:proofErr w:type="spellEnd"/>
+      <w:r>
+        <w:rPr>
+          <w:lang w:val="es-ES"/>
+        </w:rPr>
+        <w:t xml:space="preserve"> </w:t>
+      </w:r>
+      <w:proofErr w:type="spellStart"/>
+      <w:r>
+        <w:rPr>
+          <w:lang w:val="es-ES"/>
+        </w:rPr>
+        <w:t>Metabolism</w:t>
+      </w:r>
+      <w:proofErr w:type="spellEnd"/>
+      <w:r>
+        <w:rPr>
+          <w:lang w:val="es-ES"/>
+        </w:rPr>
+        <w:t xml:space="preserve"> in High-</w:t>
+      </w:r>
+      <w:proofErr w:type="spellStart"/>
+      <w:r>
+        <w:rPr>
+          <w:lang w:val="es-ES"/>
+        </w:rPr>
+        <w:t>Fat</w:t>
+      </w:r>
+      <w:proofErr w:type="spellEnd"/>
+      <w:r>
+        <w:rPr>
+          <w:lang w:val="es-ES"/>
+        </w:rPr>
+        <w:t xml:space="preserve"> </w:t>
+      </w:r>
+      <w:proofErr w:type="spellStart"/>
+      <w:r>
+        <w:rPr>
+          <w:lang w:val="es-ES"/>
+        </w:rPr>
+        <w:t>Diet-Induced</w:t>
+      </w:r>
+      <w:proofErr w:type="spellEnd"/>
+      <w:r>
+        <w:rPr>
+          <w:lang w:val="es-ES"/>
+        </w:rPr>
+        <w:t xml:space="preserve"> Obese </w:t>
+      </w:r>
+      <w:proofErr w:type="spellStart"/>
+      <w:r>
+        <w:rPr>
+          <w:lang w:val="es-ES"/>
+        </w:rPr>
+        <w:t>Mice</w:t>
+      </w:r>
+      <w:proofErr w:type="spellEnd"/>
+      <w:r>
+        <w:rPr>
+          <w:lang w:val="es-ES"/>
+        </w:rPr>
+        <w:t xml:space="preserve">. International </w:t>
+      </w:r>
+      <w:proofErr w:type="spellStart"/>
+      <w:r>
+        <w:rPr>
+          <w:lang w:val="es-ES"/>
+        </w:rPr>
+        <w:t>Journal</w:t>
+      </w:r>
+      <w:proofErr w:type="spellEnd"/>
+      <w:r>
+        <w:rPr>
+          <w:lang w:val="es-ES"/>
+        </w:rPr>
+        <w:t xml:space="preserve"> of Molecular </w:t>
+      </w:r>
+      <w:proofErr w:type="spellStart"/>
+      <w:r>
+        <w:rPr>
+          <w:lang w:val="es-ES"/>
+        </w:rPr>
+        <w:t>Sciences</w:t>
+      </w:r>
+      <w:proofErr w:type="spellEnd"/>
+      <w:r>
+        <w:rPr>
+          <w:lang w:val="es-ES"/>
+        </w:rPr>
+        <w:t>. 2024 Jan;25(13):6904.</w:t>
       </w:r>
     </w:p>
     <w:p>
       <w:pPr>
         <w:pStyle w:val="ListBullet"/>
-      </w:pPr>
-      <w:r>
-        <w:t xml:space="preserve">Jatuyosporn T, Laohawutthichai P, Ochoa Romo JP, </w:t>
+        <w:numPr>
+          <w:ilvl w:val="0"/>
+          <w:numId w:val="3"/>
+        </w:numPr>
+        <w:jc w:val="both"/>
+        <w:rPr>
+          <w:lang w:val="es-ES"/>
+        </w:rPr>
+      </w:pPr>
+      <w:proofErr w:type="spellStart"/>
+      <w:r>
+        <w:t>Jatuyosporn</w:t>
+      </w:r>
+      <w:proofErr w:type="spellEnd"/>
+      <w:r>
+        <w:t xml:space="preserve"> T, </w:t>
+      </w:r>
+      <w:proofErr w:type="spellStart"/>
+      <w:r>
+        <w:t>Laohawutthichai</w:t>
+      </w:r>
+      <w:proofErr w:type="spellEnd"/>
+      <w:r>
+        <w:t xml:space="preserve"> P, Ochoa Romo JP, </w:t>
       </w:r>
       <w:r>
         <w:rPr>
           <w:b/>
+          <w:bCs/>
         </w:rPr>
         <w:t>Gallardo-Becerra L</w:t>
       </w:r>
       <w:r>
-        <w:t>, Sánchez Lopez F, Tassanakajon A, Ochoa-Leyva A, Krusong K. White spot syndrome virus impact on the expression of immune genes and gut microbiome of black tiger shrimp *Penaeus monodon*. Sci Rep. 2023 Jan 18;13(1):996.</w:t>
+        <w:t xml:space="preserve">, Sánchez Lopez F, </w:t>
+      </w:r>
+      <w:proofErr w:type="spellStart"/>
+      <w:r>
+        <w:t>Tassanakajon</w:t>
+      </w:r>
+      <w:proofErr w:type="spellEnd"/>
+      <w:r>
+        <w:t xml:space="preserve"> A, Ochoa-Leyva A, </w:t>
+      </w:r>
+      <w:proofErr w:type="spellStart"/>
+      <w:r>
+        <w:t>Krusong</w:t>
+      </w:r>
+      <w:proofErr w:type="spellEnd"/>
+      <w:r>
+        <w:t xml:space="preserve"> K. White spot syndrome virus impact on the expression of immune genes and gut microbiome of black tiger shrimp Penaeus monodon. </w:t>
+      </w:r>
+      <w:proofErr w:type="spellStart"/>
+      <w:r>
+        <w:rPr>
+          <w:lang w:val="es-ES"/>
+        </w:rPr>
+        <w:t>Sci</w:t>
+      </w:r>
+      <w:proofErr w:type="spellEnd"/>
+      <w:r>
+        <w:rPr>
+          <w:lang w:val="es-ES"/>
+        </w:rPr>
+        <w:t xml:space="preserve"> Rep. 2023 Jan 18;13(1):996.</w:t>
       </w:r>
     </w:p>
     <w:p>
       <w:pPr>
         <w:pStyle w:val="ListBullet"/>
-      </w:pPr>
-      <w:r/>
+        <w:numPr>
+          <w:ilvl w:val="0"/>
+          <w:numId w:val="3"/>
+        </w:numPr>
+        <w:jc w:val="both"/>
+        <w:rPr>
+          <w:lang w:val="es-ES"/>
+        </w:rPr>
+      </w:pPr>
       <w:r>
         <w:rPr>
           <w:b/>
+          <w:bCs/>
+          <w:lang w:val="es-ES"/>
         </w:rPr>
         <w:t>Gallardo-Becerra L</w:t>
       </w:r>
       <w:r>
-        <w:t>, Cervantes-Echeverría M, Cornejo-Granados F, Vazquez-Morado LE, Ochoa-Leyva A. Perspectives in Searching Antimicrobial Peptides (AMPs) Produced by the Microbiota. Microb Ecol. 2023 Dec 1;87(1):8.</w:t>
+        <w:rPr>
+          <w:lang w:val="es-ES"/>
+        </w:rPr>
+        <w:t xml:space="preserve">, Cervantes-Echeverría M, Cornejo-Granados F, </w:t>
+      </w:r>
+      <w:proofErr w:type="spellStart"/>
+      <w:r>
+        <w:rPr>
+          <w:lang w:val="es-ES"/>
+        </w:rPr>
+        <w:t>Vazquez</w:t>
+      </w:r>
+      <w:proofErr w:type="spellEnd"/>
+      <w:r>
+        <w:rPr>
+          <w:lang w:val="es-ES"/>
+        </w:rPr>
+        <w:t>-Morado LE, Ochoa-Leyva A. Perspectives in Searching Antimicrobial Peptides (AMPs) Produced by the Microbiota. Microb Ecol. 2023 Dec 1;87(1):8.</w:t>
       </w:r>
     </w:p>
     <w:p>
       <w:pPr>
         <w:pStyle w:val="ListBullet"/>
-      </w:pPr>
-      <w:r>
+        <w:numPr>
+          <w:ilvl w:val="0"/>
+          <w:numId w:val="3"/>
+        </w:numPr>
+        <w:jc w:val="both"/>
+        <w:rPr>
+          <w:lang w:val="es-ES"/>
+        </w:rPr>
+      </w:pPr>
+      <w:r>
+        <w:rPr>
+          <w:lang w:val="es-ES"/>
+        </w:rPr>
         <w:t xml:space="preserve">Chino de la Cruz CM, Cornejo-Granados F, </w:t>
       </w:r>
       <w:r>
         <w:rPr>
           <w:b/>
+          <w:bCs/>
+          <w:lang w:val="es-ES"/>
         </w:rPr>
         <w:t>Gallardo-Becerra L</w:t>
       </w:r>
       <w:r>
-        <w:t>, Rodríguez-Alegría ME, Ochoa-Leyva A, López Munguía A. Complete genome sequence and characterization of a novel Enterococcus faecium with probiotic potential isolated from the gut of Litopenaeus vannamei. Microbial Genomics. 2023;9(3):000938.</w:t>
+        <w:rPr>
+          <w:lang w:val="es-ES"/>
+        </w:rPr>
+        <w:t xml:space="preserve">, Rodríguez-Alegría ME, Ochoa-Leyva A, López Munguía A. Complete </w:t>
+      </w:r>
+      <w:proofErr w:type="spellStart"/>
+      <w:r>
+        <w:rPr>
+          <w:lang w:val="es-ES"/>
+        </w:rPr>
+        <w:t>genome</w:t>
+      </w:r>
+      <w:proofErr w:type="spellEnd"/>
+      <w:r>
+        <w:rPr>
+          <w:lang w:val="es-ES"/>
+        </w:rPr>
+        <w:t xml:space="preserve"> </w:t>
+      </w:r>
+      <w:proofErr w:type="spellStart"/>
+      <w:r>
+        <w:rPr>
+          <w:lang w:val="es-ES"/>
+        </w:rPr>
+        <w:t>sequence</w:t>
+      </w:r>
+      <w:proofErr w:type="spellEnd"/>
+      <w:r>
+        <w:rPr>
+          <w:lang w:val="es-ES"/>
+        </w:rPr>
+        <w:t xml:space="preserve"> and </w:t>
+      </w:r>
+      <w:proofErr w:type="spellStart"/>
+      <w:r>
+        <w:rPr>
+          <w:lang w:val="es-ES"/>
+        </w:rPr>
+        <w:t>characterization</w:t>
+      </w:r>
+      <w:proofErr w:type="spellEnd"/>
+      <w:r>
+        <w:rPr>
+          <w:lang w:val="es-ES"/>
+        </w:rPr>
+        <w:t xml:space="preserve"> of a novel </w:t>
+      </w:r>
+      <w:proofErr w:type="spellStart"/>
+      <w:r>
+        <w:rPr>
+          <w:lang w:val="es-ES"/>
+        </w:rPr>
+        <w:t>Enterococcus</w:t>
+      </w:r>
+      <w:proofErr w:type="spellEnd"/>
+      <w:r>
+        <w:rPr>
+          <w:lang w:val="es-ES"/>
+        </w:rPr>
+        <w:t xml:space="preserve"> </w:t>
+      </w:r>
+      <w:proofErr w:type="spellStart"/>
+      <w:r>
+        <w:rPr>
+          <w:lang w:val="es-ES"/>
+        </w:rPr>
+        <w:t>faecium</w:t>
+      </w:r>
+      <w:proofErr w:type="spellEnd"/>
+      <w:r>
+        <w:rPr>
+          <w:lang w:val="es-ES"/>
+        </w:rPr>
+        <w:t xml:space="preserve"> </w:t>
+      </w:r>
+      <w:proofErr w:type="spellStart"/>
+      <w:r>
+        <w:rPr>
+          <w:lang w:val="es-ES"/>
+        </w:rPr>
+        <w:t>with</w:t>
+      </w:r>
+      <w:proofErr w:type="spellEnd"/>
+      <w:r>
+        <w:rPr>
+          <w:lang w:val="es-ES"/>
+        </w:rPr>
+        <w:t xml:space="preserve"> </w:t>
+      </w:r>
+      <w:proofErr w:type="spellStart"/>
+      <w:r>
+        <w:rPr>
+          <w:lang w:val="es-ES"/>
+        </w:rPr>
+        <w:t>probiotic</w:t>
+      </w:r>
+      <w:proofErr w:type="spellEnd"/>
+      <w:r>
+        <w:rPr>
+          <w:lang w:val="es-ES"/>
+        </w:rPr>
+        <w:t xml:space="preserve"> </w:t>
+      </w:r>
+      <w:proofErr w:type="spellStart"/>
+      <w:r>
+        <w:rPr>
+          <w:lang w:val="es-ES"/>
+        </w:rPr>
+        <w:t>potential</w:t>
+      </w:r>
+      <w:proofErr w:type="spellEnd"/>
+      <w:r>
+        <w:rPr>
+          <w:lang w:val="es-ES"/>
+        </w:rPr>
+        <w:t xml:space="preserve"> </w:t>
+      </w:r>
+      <w:proofErr w:type="spellStart"/>
+      <w:r>
+        <w:rPr>
+          <w:lang w:val="es-ES"/>
+        </w:rPr>
+        <w:t>isolated</w:t>
+      </w:r>
+      <w:proofErr w:type="spellEnd"/>
+      <w:r>
+        <w:rPr>
+          <w:lang w:val="es-ES"/>
+        </w:rPr>
+        <w:t xml:space="preserve"> </w:t>
+      </w:r>
+      <w:proofErr w:type="spellStart"/>
+      <w:r>
+        <w:rPr>
+          <w:lang w:val="es-ES"/>
+        </w:rPr>
+        <w:t>from</w:t>
+      </w:r>
+      <w:proofErr w:type="spellEnd"/>
+      <w:r>
+        <w:rPr>
+          <w:lang w:val="es-ES"/>
+        </w:rPr>
+        <w:t xml:space="preserve"> the gut of </w:t>
+      </w:r>
+      <w:proofErr w:type="spellStart"/>
+      <w:r>
+        <w:rPr>
+          <w:lang w:val="es-ES"/>
+        </w:rPr>
+        <w:t>Litopenaeus</w:t>
+      </w:r>
+      <w:proofErr w:type="spellEnd"/>
+      <w:r>
+        <w:rPr>
+          <w:lang w:val="es-ES"/>
+        </w:rPr>
+        <w:t xml:space="preserve"> </w:t>
+      </w:r>
+      <w:proofErr w:type="spellStart"/>
+      <w:r>
+        <w:rPr>
+          <w:lang w:val="es-ES"/>
+        </w:rPr>
+        <w:t>vannamei</w:t>
+      </w:r>
+      <w:proofErr w:type="spellEnd"/>
+      <w:r>
+        <w:rPr>
+          <w:lang w:val="es-ES"/>
+        </w:rPr>
+        <w:t xml:space="preserve">. Microbial </w:t>
+      </w:r>
+      <w:proofErr w:type="spellStart"/>
+      <w:r>
+        <w:rPr>
+          <w:lang w:val="es-ES"/>
+        </w:rPr>
+        <w:t>Genomics</w:t>
+      </w:r>
+      <w:proofErr w:type="spellEnd"/>
+      <w:r>
+        <w:rPr>
+          <w:lang w:val="es-ES"/>
+        </w:rPr>
+        <w:t>. 2023;9(3):000938.</w:t>
       </w:r>
     </w:p>
     <w:p>
       <w:pPr>
         <w:pStyle w:val="ListBullet"/>
+        <w:numPr>
+          <w:ilvl w:val="0"/>
+          <w:numId w:val="3"/>
+        </w:numPr>
+        <w:jc w:val="both"/>
+        <w:rPr>
+          <w:lang w:val="es-ES"/>
+        </w:rPr>
       </w:pPr>
       <w:r>
         <w:t xml:space="preserve">Cervantes-Echeverría M, </w:t>
@@ -588,35 +1912,152 @@
       <w:r>
         <w:rPr>
           <w:b/>
+          <w:bCs/>
         </w:rPr>
         <w:t>Gallardo-Becerra L</w:t>
       </w:r>
       <w:r>
-        <w:t>, Cornejo-Granados F, Ochoa-Leyva A. The Two-Faced Role of crAssphage Subfamilies in Obesity and Metabolic Syndrome: Between Good and Evil. Genes. 2023 Jan;14(1):139.</w:t>
+        <w:t xml:space="preserve">, Cornejo-Granados F, Ochoa-Leyva A. The Two-Faced Role of </w:t>
+      </w:r>
+      <w:proofErr w:type="spellStart"/>
+      <w:r>
+        <w:t>crAssphage</w:t>
+      </w:r>
+      <w:proofErr w:type="spellEnd"/>
+      <w:r>
+        <w:t xml:space="preserve"> Subfamilies in Obesity and Metabolic Syndrome: Between Good and Evil. </w:t>
+      </w:r>
+      <w:r>
+        <w:rPr>
+          <w:lang w:val="es-ES"/>
+        </w:rPr>
+        <w:t>Genes. 2023 Jan;14(1):139.</w:t>
       </w:r>
     </w:p>
     <w:p>
       <w:pPr>
         <w:pStyle w:val="ListBullet"/>
-      </w:pPr>
-      <w:r>
+        <w:numPr>
+          <w:ilvl w:val="0"/>
+          <w:numId w:val="3"/>
+        </w:numPr>
+        <w:jc w:val="both"/>
+      </w:pPr>
+      <w:r>
+        <w:rPr>
+          <w:lang w:val="es-ES"/>
+        </w:rPr>
+        <w:lastRenderedPageBreak/>
         <w:t xml:space="preserve">Palomino-Hermosillo YA, Berumen-Varela G, Ochoa-Jiménez VA, Balois-Morales R, Jiménez-Zurita JO, Bautista-Rosales PU, Martínez-González ME, López-Guzmán GG, Cortés-Cruz MA, Guzmán LF, Cornejo-Granados F, </w:t>
       </w:r>
       <w:r>
         <w:rPr>
           <w:b/>
+          <w:bCs/>
+          <w:lang w:val="es-ES"/>
         </w:rPr>
         <w:t>Gallardo-Becerra L</w:t>
       </w:r>
       <w:r>
-        <w:t>, Ochoa-Leyva A, Alia-Tejacal I. Transcriptome Analysis of Soursop (Annona muricata L.) Fruit under Postharvest Storage Identifies Genes Families Involved in Ripening. Plants (Basel). 2022 Jul 7;11(14):1798.</w:t>
+        <w:rPr>
+          <w:lang w:val="es-ES"/>
+        </w:rPr>
+        <w:t>, Ochoa-Leyva A, Alia-</w:t>
+      </w:r>
+      <w:proofErr w:type="spellStart"/>
+      <w:r>
+        <w:rPr>
+          <w:lang w:val="es-ES"/>
+        </w:rPr>
+        <w:t>Tejacal</w:t>
+      </w:r>
+      <w:proofErr w:type="spellEnd"/>
+      <w:r>
+        <w:rPr>
+          <w:lang w:val="es-ES"/>
+        </w:rPr>
+        <w:t xml:space="preserve"> I. </w:t>
+      </w:r>
+      <w:proofErr w:type="spellStart"/>
+      <w:r>
+        <w:rPr>
+          <w:lang w:val="es-ES"/>
+        </w:rPr>
+        <w:t>Transcriptome</w:t>
+      </w:r>
+      <w:proofErr w:type="spellEnd"/>
+      <w:r>
+        <w:rPr>
+          <w:lang w:val="es-ES"/>
+        </w:rPr>
+        <w:t xml:space="preserve"> Analysis of </w:t>
+      </w:r>
+      <w:proofErr w:type="spellStart"/>
+      <w:r>
+        <w:rPr>
+          <w:lang w:val="es-ES"/>
+        </w:rPr>
+        <w:t>Soursop</w:t>
+      </w:r>
+      <w:proofErr w:type="spellEnd"/>
+      <w:r>
+        <w:rPr>
+          <w:lang w:val="es-ES"/>
+        </w:rPr>
+        <w:t xml:space="preserve"> (</w:t>
+      </w:r>
+      <w:proofErr w:type="spellStart"/>
+      <w:r>
+        <w:rPr>
+          <w:lang w:val="es-ES"/>
+        </w:rPr>
+        <w:t>Annona</w:t>
+      </w:r>
+      <w:proofErr w:type="spellEnd"/>
+      <w:r>
+        <w:rPr>
+          <w:lang w:val="es-ES"/>
+        </w:rPr>
+        <w:t xml:space="preserve"> </w:t>
+      </w:r>
+      <w:proofErr w:type="spellStart"/>
+      <w:r>
+        <w:rPr>
+          <w:lang w:val="es-ES"/>
+        </w:rPr>
+        <w:t>muricata</w:t>
+      </w:r>
+      <w:proofErr w:type="spellEnd"/>
+      <w:r>
+        <w:rPr>
+          <w:lang w:val="es-ES"/>
+        </w:rPr>
+        <w:t xml:space="preserve"> L.) </w:t>
+      </w:r>
+      <w:r>
+        <w:t xml:space="preserve">Fruit under Postharvest Storage Identifies Genes Families Involved in Ripening. </w:t>
+      </w:r>
+      <w:r>
+        <w:t>Plants (Basel). 2022 Jul 7;11(14):1798.</w:t>
       </w:r>
     </w:p>
     <w:p>
       <w:pPr>
         <w:pStyle w:val="ListBullet"/>
-      </w:pPr>
-      <w:r>
+        <w:numPr>
+          <w:ilvl w:val="0"/>
+          <w:numId w:val="3"/>
+        </w:numPr>
+        <w:jc w:val="both"/>
+        <w:rPr>
+          <w:bCs/>
+          <w:lang w:val="es-ES"/>
+        </w:rPr>
+      </w:pPr>
+      <w:r>
+        <w:rPr>
+          <w:bCs/>
+        </w:rPr>
         <w:t xml:space="preserve">Ochoa-Romo JP, Cornejo-Granados F, Lopez-Zavala AA, Viana MT, Sánchez F, </w:t>
       </w:r>
       <w:r>
@@ -626,12 +2067,55 @@
         <w:t>Gallardo-Becerra L</w:t>
       </w:r>
       <w:r>
-        <w:t>, Luque-Villegas M, Valdez-López Y, Sotelo-Mundo RR, Cota-Huízar A, López-Munguia A, Ochoa-Leyva A. Agavin induces beneficial microbes in the shrimp microbiota under farming conditions. Sci Rep. 2022 Apr 16;12(1):6392.</w:t>
+        <w:rPr>
+          <w:bCs/>
+        </w:rPr>
+        <w:t xml:space="preserve">, Luque-Villegas M, Valdez-López Y, Sotelo-Mundo RR, Cota-Huízar A, López-Munguia A, Ochoa-Leyva A. Agavin induces beneficial microbes in the shrimp microbiota under farming conditions. </w:t>
+      </w:r>
+      <w:proofErr w:type="spellStart"/>
+      <w:r>
+        <w:rPr>
+          <w:bCs/>
+          <w:lang w:val="es-ES"/>
+        </w:rPr>
+        <w:t>Sci</w:t>
+      </w:r>
+      <w:proofErr w:type="spellEnd"/>
+      <w:r>
+        <w:rPr>
+          <w:bCs/>
+          <w:lang w:val="es-ES"/>
+        </w:rPr>
+        <w:t xml:space="preserve"> Rep. 2022 </w:t>
+      </w:r>
+      <w:proofErr w:type="spellStart"/>
+      <w:r>
+        <w:rPr>
+          <w:bCs/>
+          <w:lang w:val="es-ES"/>
+        </w:rPr>
+        <w:t>Apr</w:t>
+      </w:r>
+      <w:proofErr w:type="spellEnd"/>
+      <w:r>
+        <w:rPr>
+          <w:bCs/>
+          <w:lang w:val="es-ES"/>
+        </w:rPr>
+        <w:t xml:space="preserve"> 16;12(1):6392. </w:t>
       </w:r>
     </w:p>
     <w:p>
       <w:pPr>
         <w:pStyle w:val="ListBullet"/>
+        <w:numPr>
+          <w:ilvl w:val="0"/>
+          <w:numId w:val="3"/>
+        </w:numPr>
+        <w:jc w:val="both"/>
+        <w:rPr>
+          <w:lang w:val="es-ES"/>
+        </w:rPr>
       </w:pPr>
       <w:r>
         <w:t xml:space="preserve">Bikel S, </w:t>
@@ -639,48 +2123,227 @@
       <w:r>
         <w:rPr>
           <w:b/>
+          <w:bCs/>
         </w:rPr>
         <w:t>Gallardo-Becerra L</w:t>
       </w:r>
       <w:r>
-        <w:t>, Cornejo-Granados F, Ochoa-Leyva A. Protocol for the isolation, sequencing, and analysis of the gut phageome from human fecal samples. STAR Protocols. 2022 Mar 18;3(1):101170.</w:t>
+        <w:t xml:space="preserve">, Cornejo-Granados F, Ochoa-Leyva A. Protocol for the isolation, sequencing, and analysis of the gut </w:t>
+      </w:r>
+      <w:proofErr w:type="spellStart"/>
+      <w:r>
+        <w:t>phageome</w:t>
+      </w:r>
+      <w:proofErr w:type="spellEnd"/>
+      <w:r>
+        <w:t xml:space="preserve"> from human fecal samples. </w:t>
+      </w:r>
+      <w:r>
+        <w:rPr>
+          <w:lang w:val="es-ES"/>
+        </w:rPr>
+        <w:t xml:space="preserve">STAR </w:t>
+      </w:r>
+      <w:proofErr w:type="spellStart"/>
+      <w:r>
+        <w:rPr>
+          <w:lang w:val="es-ES"/>
+        </w:rPr>
+        <w:t>Protocols</w:t>
+      </w:r>
+      <w:proofErr w:type="spellEnd"/>
+      <w:r>
+        <w:rPr>
+          <w:lang w:val="es-ES"/>
+        </w:rPr>
+        <w:t>. 2022 Mar 18;3(1):101170.</w:t>
       </w:r>
     </w:p>
     <w:p>
       <w:pPr>
         <w:pStyle w:val="ListBullet"/>
-      </w:pPr>
-      <w:r>
+        <w:numPr>
+          <w:ilvl w:val="0"/>
+          <w:numId w:val="3"/>
+        </w:numPr>
+        <w:jc w:val="both"/>
+        <w:rPr>
+          <w:lang w:val="es-ES"/>
+        </w:rPr>
+      </w:pPr>
+      <w:r>
+        <w:rPr>
+          <w:lang w:val="es-ES"/>
+        </w:rPr>
         <w:t xml:space="preserve">Bikel S, López-Leal G, Cornejo-Granados F, </w:t>
       </w:r>
       <w:r>
         <w:rPr>
           <w:b/>
+          <w:bCs/>
+          <w:lang w:val="es-ES"/>
         </w:rPr>
         <w:t>Gallardo-Becerra L</w:t>
       </w:r>
       <w:r>
-        <w:t>, García-López R, Sánchez F, Equihua-Medina E, Ochoa-Romo JP, López-Contreras BE, Canizales-Quinteros S, Hernández-Reyna A, Mendoza-Vargas A, Ochoa-Leyva A. Gut dsDNA virome shows diversity and richness alterations associated with childhood obesity and metabolic syndrome. iScience. 2021 Aug 20;24(8):102900.</w:t>
+        <w:rPr>
+          <w:lang w:val="es-ES"/>
+        </w:rPr>
+        <w:t xml:space="preserve">, García-López R, Sánchez F, Equihua-Medina E, Ochoa-Romo JP, López-Contreras BE, Canizales-Quinteros S, Hernández-Reyna A, Mendoza-Vargas A, Ochoa-Leyva A. Gut </w:t>
+      </w:r>
+      <w:proofErr w:type="spellStart"/>
+      <w:r>
+        <w:rPr>
+          <w:lang w:val="es-ES"/>
+        </w:rPr>
+        <w:t>dsDNA</w:t>
+      </w:r>
+      <w:proofErr w:type="spellEnd"/>
+      <w:r>
+        <w:rPr>
+          <w:lang w:val="es-ES"/>
+        </w:rPr>
+        <w:t xml:space="preserve"> virome </w:t>
+      </w:r>
+      <w:proofErr w:type="gramStart"/>
+      <w:r>
+        <w:rPr>
+          <w:lang w:val="es-ES"/>
+        </w:rPr>
+        <w:t>shows</w:t>
+      </w:r>
+      <w:proofErr w:type="gramEnd"/>
+      <w:r>
+        <w:rPr>
+          <w:lang w:val="es-ES"/>
+        </w:rPr>
+        <w:t xml:space="preserve"> </w:t>
+      </w:r>
+      <w:proofErr w:type="spellStart"/>
+      <w:r>
+        <w:rPr>
+          <w:lang w:val="es-ES"/>
+        </w:rPr>
+        <w:t>diversity</w:t>
+      </w:r>
+      <w:proofErr w:type="spellEnd"/>
+      <w:r>
+        <w:rPr>
+          <w:lang w:val="es-ES"/>
+        </w:rPr>
+        <w:t xml:space="preserve"> and </w:t>
+      </w:r>
+      <w:proofErr w:type="spellStart"/>
+      <w:r>
+        <w:rPr>
+          <w:lang w:val="es-ES"/>
+        </w:rPr>
+        <w:t>richness</w:t>
+      </w:r>
+      <w:proofErr w:type="spellEnd"/>
+      <w:r>
+        <w:rPr>
+          <w:lang w:val="es-ES"/>
+        </w:rPr>
+        <w:t xml:space="preserve"> </w:t>
+      </w:r>
+      <w:proofErr w:type="spellStart"/>
+      <w:r>
+        <w:rPr>
+          <w:lang w:val="es-ES"/>
+        </w:rPr>
+        <w:t>alterations</w:t>
+      </w:r>
+      <w:proofErr w:type="spellEnd"/>
+      <w:r>
+        <w:rPr>
+          <w:lang w:val="es-ES"/>
+        </w:rPr>
+        <w:t xml:space="preserve"> </w:t>
+      </w:r>
+      <w:proofErr w:type="spellStart"/>
+      <w:r>
+        <w:rPr>
+          <w:lang w:val="es-ES"/>
+        </w:rPr>
+        <w:t>associated</w:t>
+      </w:r>
+      <w:proofErr w:type="spellEnd"/>
+      <w:r>
+        <w:rPr>
+          <w:lang w:val="es-ES"/>
+        </w:rPr>
+        <w:t xml:space="preserve"> </w:t>
+      </w:r>
+      <w:proofErr w:type="spellStart"/>
+      <w:r>
+        <w:rPr>
+          <w:lang w:val="es-ES"/>
+        </w:rPr>
+        <w:t>with</w:t>
+      </w:r>
+      <w:proofErr w:type="spellEnd"/>
+      <w:r>
+        <w:rPr>
+          <w:lang w:val="es-ES"/>
+        </w:rPr>
+        <w:t xml:space="preserve"> </w:t>
+      </w:r>
+      <w:proofErr w:type="spellStart"/>
+      <w:r>
+        <w:rPr>
+          <w:lang w:val="es-ES"/>
+        </w:rPr>
+        <w:t>childhood</w:t>
+      </w:r>
+      <w:proofErr w:type="spellEnd"/>
+      <w:r>
+        <w:rPr>
+          <w:lang w:val="es-ES"/>
+        </w:rPr>
+        <w:t xml:space="preserve"> obesity and metabolic syndrome. iScience. 2021 Aug 20;24(8):102900.</w:t>
       </w:r>
     </w:p>
     <w:p>
       <w:pPr>
         <w:pStyle w:val="ListBullet"/>
-      </w:pPr>
-      <w:r/>
+        <w:numPr>
+          <w:ilvl w:val="0"/>
+          <w:numId w:val="3"/>
+        </w:numPr>
+        <w:jc w:val="both"/>
+        <w:rPr>
+          <w:lang w:val="es-ES"/>
+        </w:rPr>
+      </w:pPr>
       <w:r>
         <w:rPr>
           <w:b/>
+          <w:bCs/>
         </w:rPr>
         <w:t>Gallardo-Becerra L</w:t>
       </w:r>
       <w:r>
-        <w:t>, Cornejo-Granados F, García-López R, Valdez-Lara A, Bikel S, Canizales-Quinteros S, López-Contreras BE, Mendoza-Vargas A, Nielsen H, Ochoa-Leyva A. Metatranscriptomic analysis to define the Secrebiome, and 16S rRNA profiling of the gut microbiome in obesity and metabolic syndrome of Mexican children. Microb Cell Fact. 2020 Dec;19(1):61.</w:t>
+        <w:t xml:space="preserve">, Cornejo-Granados F, García-López R, Valdez-Lara A, Bikel S, Canizales-Quinteros S, López-Contreras BE, Mendoza-Vargas A, Nielsen H, Ochoa-Leyva A. Metatranscriptomic analysis to define the Secrebiome, and 16S rRNA profiling of the gut microbiome in obesity and metabolic syndrome of Mexican children. </w:t>
+      </w:r>
+      <w:r>
+        <w:rPr>
+          <w:lang w:val="es-ES"/>
+        </w:rPr>
+        <w:t>Microb Cell Fact. 2020 Dec;19(1):61.</w:t>
       </w:r>
     </w:p>
     <w:p>
       <w:pPr>
         <w:pStyle w:val="ListBullet"/>
+        <w:numPr>
+          <w:ilvl w:val="0"/>
+          <w:numId w:val="3"/>
+        </w:numPr>
+        <w:jc w:val="both"/>
+        <w:rPr>
+          <w:lang w:val="es-ES"/>
+        </w:rPr>
       </w:pPr>
       <w:r>
         <w:t xml:space="preserve">Cornejo-Granados F, </w:t>
@@ -688,29 +2351,319 @@
       <w:r>
         <w:rPr>
           <w:b/>
+          <w:bCs/>
         </w:rPr>
         <w:t>Gallardo-Becerra L</w:t>
       </w:r>
       <w:r>
-        <w:t>, Leonardo-Reza M, Ochoa-Romo JP, Ochoa-Leyva A. A meta-analysis reveals the environmental and host factors shaping the structure and function of the shrimp microbiota. PeerJ. 2018 Aug 10;6:e5382.</w:t>
+        <w:t xml:space="preserve">, Leonardo-Reza M, Ochoa-Romo JP, Ochoa-Leyva A. A meta-analysis reveals the environmental and host factors shaping the structure and function of the shrimp microbiota. </w:t>
+      </w:r>
+      <w:r>
+        <w:rPr>
+          <w:lang w:val="es-ES"/>
+        </w:rPr>
+        <w:t>PeerJ. 2018 Aug 10;</w:t>
+      </w:r>
+      <w:proofErr w:type="gramStart"/>
+      <w:r>
+        <w:rPr>
+          <w:lang w:val="es-ES"/>
+        </w:rPr>
+        <w:t>6:e</w:t>
+      </w:r>
+      <w:proofErr w:type="gramEnd"/>
+      <w:r>
+        <w:rPr>
+          <w:lang w:val="es-ES"/>
+        </w:rPr>
+        <w:t>5382.</w:t>
       </w:r>
     </w:p>
     <w:p>
       <w:pPr>
         <w:pStyle w:val="ListBullet"/>
-      </w:pPr>
-      <w:r>
-        <w:t xml:space="preserve">Cornejo-Granados F, Lopez-Zavala AA, </w:t>
+        <w:numPr>
+          <w:ilvl w:val="0"/>
+          <w:numId w:val="3"/>
+        </w:numPr>
+        <w:jc w:val="both"/>
+        <w:rPr>
+          <w:bCs/>
+          <w:lang w:val="es-ES"/>
+        </w:rPr>
+      </w:pPr>
+      <w:r>
+        <w:rPr>
+          <w:bCs/>
+          <w:lang w:val="es-ES"/>
+        </w:rPr>
+        <w:t xml:space="preserve">Cornejo-Granados F, </w:t>
+      </w:r>
+      <w:proofErr w:type="spellStart"/>
+      <w:r>
+        <w:rPr>
+          <w:bCs/>
+          <w:lang w:val="es-ES"/>
+        </w:rPr>
+        <w:t>Lopez</w:t>
+      </w:r>
+      <w:proofErr w:type="spellEnd"/>
+      <w:r>
+        <w:rPr>
+          <w:bCs/>
+          <w:lang w:val="es-ES"/>
+        </w:rPr>
+        <w:t xml:space="preserve">-Zavala AA, </w:t>
       </w:r>
       <w:r>
         <w:rPr>
           <w:b/>
+          <w:lang w:val="es-ES"/>
         </w:rPr>
         <w:t>Gallardo-Becerra L</w:t>
       </w:r>
       <w:r>
-        <w:t>, Mendoza-Vargas A, Sánchez F, Vichido R, Brieba LG, Viana MT, Sotelo-Mundo RR, Ochoa-Leyva A. Microbiome of Pacific Whiteleg shrimp reveals differential bacterial community composition between Wild, Aquacultured and AHPND/EMS outbreak conditions. Sci Rep. 2017 Dec;7(1):11783.</w:t>
-      </w:r>
+        <w:rPr>
+          <w:bCs/>
+          <w:lang w:val="es-ES"/>
+        </w:rPr>
+        <w:t xml:space="preserve">, Mendoza-Vargas A, Sánchez F, </w:t>
+      </w:r>
+      <w:proofErr w:type="spellStart"/>
+      <w:r>
+        <w:rPr>
+          <w:bCs/>
+          <w:lang w:val="es-ES"/>
+        </w:rPr>
+        <w:t>Vichido</w:t>
+      </w:r>
+      <w:proofErr w:type="spellEnd"/>
+      <w:r>
+        <w:rPr>
+          <w:bCs/>
+          <w:lang w:val="es-ES"/>
+        </w:rPr>
+        <w:t xml:space="preserve"> R, </w:t>
+      </w:r>
+      <w:proofErr w:type="spellStart"/>
+      <w:r>
+        <w:rPr>
+          <w:bCs/>
+          <w:lang w:val="es-ES"/>
+        </w:rPr>
+        <w:t>Brieba</w:t>
+      </w:r>
+      <w:proofErr w:type="spellEnd"/>
+      <w:r>
+        <w:rPr>
+          <w:bCs/>
+          <w:lang w:val="es-ES"/>
+        </w:rPr>
+        <w:t xml:space="preserve"> LG, Viana MT, Sotelo-Mundo RR, Ochoa-Leyva A. Microbiome of Pacific </w:t>
+      </w:r>
+      <w:proofErr w:type="spellStart"/>
+      <w:r>
+        <w:rPr>
+          <w:bCs/>
+          <w:lang w:val="es-ES"/>
+        </w:rPr>
+        <w:t>Whiteleg</w:t>
+      </w:r>
+      <w:proofErr w:type="spellEnd"/>
+      <w:r>
+        <w:rPr>
+          <w:bCs/>
+          <w:lang w:val="es-ES"/>
+        </w:rPr>
+        <w:t xml:space="preserve"> </w:t>
+      </w:r>
+      <w:proofErr w:type="spellStart"/>
+      <w:r>
+        <w:rPr>
+          <w:bCs/>
+          <w:lang w:val="es-ES"/>
+        </w:rPr>
+        <w:t>shrimp</w:t>
+      </w:r>
+      <w:proofErr w:type="spellEnd"/>
+      <w:r>
+        <w:rPr>
+          <w:bCs/>
+          <w:lang w:val="es-ES"/>
+        </w:rPr>
+        <w:t xml:space="preserve"> </w:t>
+      </w:r>
+      <w:proofErr w:type="spellStart"/>
+      <w:r>
+        <w:rPr>
+          <w:bCs/>
+          <w:lang w:val="es-ES"/>
+        </w:rPr>
+        <w:t>reveals</w:t>
+      </w:r>
+      <w:proofErr w:type="spellEnd"/>
+      <w:r>
+        <w:rPr>
+          <w:bCs/>
+          <w:lang w:val="es-ES"/>
+        </w:rPr>
+        <w:t xml:space="preserve"> </w:t>
+      </w:r>
+      <w:proofErr w:type="spellStart"/>
+      <w:r>
+        <w:rPr>
+          <w:bCs/>
+          <w:lang w:val="es-ES"/>
+        </w:rPr>
+        <w:t>differential</w:t>
+      </w:r>
+      <w:proofErr w:type="spellEnd"/>
+      <w:r>
+        <w:rPr>
+          <w:bCs/>
+          <w:lang w:val="es-ES"/>
+        </w:rPr>
+        <w:t xml:space="preserve"> </w:t>
+      </w:r>
+      <w:proofErr w:type="spellStart"/>
+      <w:r>
+        <w:rPr>
+          <w:bCs/>
+          <w:lang w:val="es-ES"/>
+        </w:rPr>
+        <w:t>bacterial</w:t>
+      </w:r>
+      <w:proofErr w:type="spellEnd"/>
+      <w:r>
+        <w:rPr>
+          <w:bCs/>
+          <w:lang w:val="es-ES"/>
+        </w:rPr>
+        <w:t xml:space="preserve"> </w:t>
+      </w:r>
+      <w:proofErr w:type="spellStart"/>
+      <w:r>
+        <w:rPr>
+          <w:bCs/>
+          <w:lang w:val="es-ES"/>
+        </w:rPr>
+        <w:t>community</w:t>
+      </w:r>
+      <w:proofErr w:type="spellEnd"/>
+      <w:r>
+        <w:rPr>
+          <w:bCs/>
+          <w:lang w:val="es-ES"/>
+        </w:rPr>
+        <w:t xml:space="preserve"> </w:t>
+      </w:r>
+      <w:proofErr w:type="spellStart"/>
+      <w:r>
+        <w:rPr>
+          <w:bCs/>
+          <w:lang w:val="es-ES"/>
+        </w:rPr>
+        <w:t>composition</w:t>
+      </w:r>
+      <w:proofErr w:type="spellEnd"/>
+      <w:r>
+        <w:rPr>
+          <w:bCs/>
+          <w:lang w:val="es-ES"/>
+        </w:rPr>
+        <w:t xml:space="preserve"> </w:t>
+      </w:r>
+      <w:proofErr w:type="spellStart"/>
+      <w:r>
+        <w:rPr>
+          <w:bCs/>
+          <w:lang w:val="es-ES"/>
+        </w:rPr>
+        <w:t>between</w:t>
+      </w:r>
+      <w:proofErr w:type="spellEnd"/>
+      <w:r>
+        <w:rPr>
+          <w:bCs/>
+          <w:lang w:val="es-ES"/>
+        </w:rPr>
+        <w:t xml:space="preserve"> Wild, </w:t>
+      </w:r>
+      <w:proofErr w:type="spellStart"/>
+      <w:r>
+        <w:rPr>
+          <w:bCs/>
+          <w:lang w:val="es-ES"/>
+        </w:rPr>
+        <w:t>Aquacultured</w:t>
+      </w:r>
+      <w:proofErr w:type="spellEnd"/>
+      <w:r>
+        <w:rPr>
+          <w:bCs/>
+          <w:lang w:val="es-ES"/>
+        </w:rPr>
+        <w:t xml:space="preserve"> and AHPND/EMS </w:t>
+      </w:r>
+      <w:proofErr w:type="spellStart"/>
+      <w:r>
+        <w:rPr>
+          <w:bCs/>
+          <w:lang w:val="es-ES"/>
+        </w:rPr>
+        <w:t>outbreak</w:t>
+      </w:r>
+      <w:proofErr w:type="spellEnd"/>
+      <w:r>
+        <w:rPr>
+          <w:bCs/>
+          <w:lang w:val="es-ES"/>
+        </w:rPr>
+        <w:t xml:space="preserve"> </w:t>
+      </w:r>
+      <w:proofErr w:type="spellStart"/>
+      <w:r>
+        <w:rPr>
+          <w:bCs/>
+          <w:lang w:val="es-ES"/>
+        </w:rPr>
+        <w:t>conditions</w:t>
+      </w:r>
+      <w:proofErr w:type="spellEnd"/>
+      <w:r>
+        <w:rPr>
+          <w:bCs/>
+          <w:lang w:val="es-ES"/>
+        </w:rPr>
+        <w:t xml:space="preserve">. </w:t>
+      </w:r>
+      <w:proofErr w:type="spellStart"/>
+      <w:r>
+        <w:rPr>
+          <w:bCs/>
+          <w:lang w:val="es-ES"/>
+        </w:rPr>
+        <w:t>Sci</w:t>
+      </w:r>
+      <w:proofErr w:type="spellEnd"/>
+      <w:r>
+        <w:rPr>
+          <w:bCs/>
+          <w:lang w:val="es-ES"/>
+        </w:rPr>
+        <w:t xml:space="preserve"> Rep. 2017 Dec;7(1):11783.</w:t>
+      </w:r>
+    </w:p>
+    <w:p>
+      <w:pPr>
+        <w:pStyle w:val="ListBullet"/>
+        <w:numPr>
+          <w:ilvl w:val="0"/>
+          <w:numId w:val="0"/>
+        </w:numPr>
+        <w:ind w:left="720"/>
+        <w:jc w:val="both"/>
+      </w:pPr>
     </w:p>
     <w:sectPr>
       <w:pgSz w:w="12240" w:h="15840"/>
@@ -858,11 +2811,216 @@
       </w:rPr>
     </w:lvl>
   </w:abstractNum>
+  <w:abstractNum w:abstractNumId="2" w15:restartNumberingAfterBreak="0">
+    <w:nsid w:val="54020DFA"/>
+    <w:multiLevelType w:val="hybridMultilevel"/>
+    <w:tmpl w:val="B68E07E8"/>
+    <w:lvl w:ilvl="0" w:tplc="04090001">
+      <w:start w:val="1"/>
+      <w:numFmt w:val="bullet"/>
+      <w:lvlText w:val=""/>
+      <w:lvlJc w:val="left"/>
+      <w:pPr>
+        <w:ind w:left="720" w:hanging="360"/>
+      </w:pPr>
+      <w:rPr>
+        <w:rFonts w:ascii="Symbol" w:hAnsi="Symbol" w:hint="default"/>
+      </w:rPr>
+    </w:lvl>
+    <w:lvl w:ilvl="1" w:tplc="04090003" w:tentative="1">
+      <w:start w:val="1"/>
+      <w:numFmt w:val="bullet"/>
+      <w:lvlText w:val="o"/>
+      <w:lvlJc w:val="left"/>
+      <w:pPr>
+        <w:ind w:left="1440" w:hanging="360"/>
+      </w:pPr>
+      <w:rPr>
+        <w:rFonts w:ascii="Courier New" w:hAnsi="Courier New" w:cs="Courier New" w:hint="default"/>
+      </w:rPr>
+    </w:lvl>
+    <w:lvl w:ilvl="2" w:tplc="04090005" w:tentative="1">
+      <w:start w:val="1"/>
+      <w:numFmt w:val="bullet"/>
+      <w:lvlText w:val=""/>
+      <w:lvlJc w:val="left"/>
+      <w:pPr>
+        <w:ind w:left="2160" w:hanging="360"/>
+      </w:pPr>
+      <w:rPr>
+        <w:rFonts w:ascii="Wingdings" w:hAnsi="Wingdings" w:hint="default"/>
+      </w:rPr>
+    </w:lvl>
+    <w:lvl w:ilvl="3" w:tplc="04090001" w:tentative="1">
+      <w:start w:val="1"/>
+      <w:numFmt w:val="bullet"/>
+      <w:lvlText w:val=""/>
+      <w:lvlJc w:val="left"/>
+      <w:pPr>
+        <w:ind w:left="2880" w:hanging="360"/>
+      </w:pPr>
+      <w:rPr>
+        <w:rFonts w:ascii="Symbol" w:hAnsi="Symbol" w:hint="default"/>
+      </w:rPr>
+    </w:lvl>
+    <w:lvl w:ilvl="4" w:tplc="04090003" w:tentative="1">
+      <w:start w:val="1"/>
+      <w:numFmt w:val="bullet"/>
+      <w:lvlText w:val="o"/>
+      <w:lvlJc w:val="left"/>
+      <w:pPr>
+        <w:ind w:left="3600" w:hanging="360"/>
+      </w:pPr>
+      <w:rPr>
+        <w:rFonts w:ascii="Courier New" w:hAnsi="Courier New" w:cs="Courier New" w:hint="default"/>
+      </w:rPr>
+    </w:lvl>
+    <w:lvl w:ilvl="5" w:tplc="04090005" w:tentative="1">
+      <w:start w:val="1"/>
+      <w:numFmt w:val="bullet"/>
+      <w:lvlText w:val=""/>
+      <w:lvlJc w:val="left"/>
+      <w:pPr>
+        <w:ind w:left="4320" w:hanging="360"/>
+      </w:pPr>
+      <w:rPr>
+        <w:rFonts w:ascii="Wingdings" w:hAnsi="Wingdings" w:hint="default"/>
+      </w:rPr>
+    </w:lvl>
+    <w:lvl w:ilvl="6" w:tplc="04090001" w:tentative="1">
+      <w:start w:val="1"/>
+      <w:numFmt w:val="bullet"/>
+      <w:lvlText w:val=""/>
+      <w:lvlJc w:val="left"/>
+      <w:pPr>
+        <w:ind w:left="5040" w:hanging="360"/>
+      </w:pPr>
+      <w:rPr>
+        <w:rFonts w:ascii="Symbol" w:hAnsi="Symbol" w:hint="default"/>
+      </w:rPr>
+    </w:lvl>
+    <w:lvl w:ilvl="7" w:tplc="04090003" w:tentative="1">
+      <w:start w:val="1"/>
+      <w:numFmt w:val="bullet"/>
+      <w:lvlText w:val="o"/>
+      <w:lvlJc w:val="left"/>
+      <w:pPr>
+        <w:ind w:left="5760" w:hanging="360"/>
+      </w:pPr>
+      <w:rPr>
+        <w:rFonts w:ascii="Courier New" w:hAnsi="Courier New" w:cs="Courier New" w:hint="default"/>
+      </w:rPr>
+    </w:lvl>
+    <w:lvl w:ilvl="8" w:tplc="04090005" w:tentative="1">
+      <w:start w:val="1"/>
+      <w:numFmt w:val="bullet"/>
+      <w:lvlText w:val=""/>
+      <w:lvlJc w:val="left"/>
+      <w:pPr>
+        <w:ind w:left="6480" w:hanging="360"/>
+      </w:pPr>
+      <w:rPr>
+        <w:rFonts w:ascii="Wingdings" w:hAnsi="Wingdings" w:hint="default"/>
+      </w:rPr>
+    </w:lvl>
+  </w:abstractNum>
+  <w:abstractNum w:abstractNumId="3" w15:restartNumberingAfterBreak="0">
+    <w:nsid w:val="636E4868"/>
+    <w:multiLevelType w:val="hybridMultilevel"/>
+    <w:tmpl w:val="0BA62D28"/>
+    <w:lvl w:ilvl="0" w:tplc="0409000F">
+      <w:start w:val="1"/>
+      <w:numFmt w:val="decimal"/>
+      <w:lvlText w:val="%1."/>
+      <w:lvlJc w:val="left"/>
+      <w:pPr>
+        <w:ind w:left="360" w:hanging="360"/>
+      </w:pPr>
+    </w:lvl>
+    <w:lvl w:ilvl="1" w:tplc="04090019" w:tentative="1">
+      <w:start w:val="1"/>
+      <w:numFmt w:val="lowerLetter"/>
+      <w:lvlText w:val="%2."/>
+      <w:lvlJc w:val="left"/>
+      <w:pPr>
+        <w:ind w:left="1080" w:hanging="360"/>
+      </w:pPr>
+    </w:lvl>
+    <w:lvl w:ilvl="2" w:tplc="0409001B" w:tentative="1">
+      <w:start w:val="1"/>
+      <w:numFmt w:val="lowerRoman"/>
+      <w:lvlText w:val="%3."/>
+      <w:lvlJc w:val="right"/>
+      <w:pPr>
+        <w:ind w:left="1800" w:hanging="180"/>
+      </w:pPr>
+    </w:lvl>
+    <w:lvl w:ilvl="3" w:tplc="0409000F" w:tentative="1">
+      <w:start w:val="1"/>
+      <w:numFmt w:val="decimal"/>
+      <w:lvlText w:val="%4."/>
+      <w:lvlJc w:val="left"/>
+      <w:pPr>
+        <w:ind w:left="2520" w:hanging="360"/>
+      </w:pPr>
+    </w:lvl>
+    <w:lvl w:ilvl="4" w:tplc="04090019" w:tentative="1">
+      <w:start w:val="1"/>
+      <w:numFmt w:val="lowerLetter"/>
+      <w:lvlText w:val="%5."/>
+      <w:lvlJc w:val="left"/>
+      <w:pPr>
+        <w:ind w:left="3240" w:hanging="360"/>
+      </w:pPr>
+    </w:lvl>
+    <w:lvl w:ilvl="5" w:tplc="0409001B" w:tentative="1">
+      <w:start w:val="1"/>
+      <w:numFmt w:val="lowerRoman"/>
+      <w:lvlText w:val="%6."/>
+      <w:lvlJc w:val="right"/>
+      <w:pPr>
+        <w:ind w:left="3960" w:hanging="180"/>
+      </w:pPr>
+    </w:lvl>
+    <w:lvl w:ilvl="6" w:tplc="0409000F" w:tentative="1">
+      <w:start w:val="1"/>
+      <w:numFmt w:val="decimal"/>
+      <w:lvlText w:val="%7."/>
+      <w:lvlJc w:val="left"/>
+      <w:pPr>
+        <w:ind w:left="4680" w:hanging="360"/>
+      </w:pPr>
+    </w:lvl>
+    <w:lvl w:ilvl="7" w:tplc="04090019" w:tentative="1">
+      <w:start w:val="1"/>
+      <w:numFmt w:val="lowerLetter"/>
+      <w:lvlText w:val="%8."/>
+      <w:lvlJc w:val="left"/>
+      <w:pPr>
+        <w:ind w:left="5400" w:hanging="360"/>
+      </w:pPr>
+    </w:lvl>
+    <w:lvl w:ilvl="8" w:tplc="0409001B" w:tentative="1">
+      <w:start w:val="1"/>
+      <w:numFmt w:val="lowerRoman"/>
+      <w:lvlText w:val="%9."/>
+      <w:lvlJc w:val="right"/>
+      <w:pPr>
+        <w:ind w:left="6120" w:hanging="180"/>
+      </w:pPr>
+    </w:lvl>
+  </w:abstractNum>
   <w:num w:numId="1" w16cid:durableId="1203640870">
     <w:abstractNumId w:val="1"/>
   </w:num>
   <w:num w:numId="2" w16cid:durableId="283390146">
     <w:abstractNumId w:val="0"/>
+  </w:num>
+  <w:num w:numId="3" w16cid:durableId="1393382507">
+    <w:abstractNumId w:val="3"/>
+  </w:num>
+  <w:num w:numId="4" w16cid:durableId="162358847">
+    <w:abstractNumId w:val="2"/>
   </w:num>
 </w:numbering>
 </file>
@@ -1542,6 +3700,18 @@
       <w:smallCaps w:val="0"/>
     </w:rPr>
   </w:style>
+  <w:style w:type="character" w:styleId="FollowedHyperlink">
+    <w:name w:val="FollowedHyperlink"/>
+    <w:basedOn w:val="DefaultParagraphFont"/>
+    <w:uiPriority w:val="99"/>
+    <w:semiHidden/>
+    <w:unhideWhenUsed/>
+    <w:rsid w:val="00275C0C"/>
+    <w:rPr>
+      <w:color w:val="96607D" w:themeColor="followedHyperlink"/>
+      <w:u w:val="single"/>
+    </w:rPr>
+  </w:style>
 </w:styles>
 </file>
 
@@ -1747,10 +3917,6 @@
 </file>
 
 <file path=customXml/item1.xml><?xml version="1.0" encoding="utf-8"?>
-<b:Sources xmlns:b="http://schemas.openxmlformats.org/officeDocument/2006/bibliography" xmlns="http://schemas.openxmlformats.org/officeDocument/2006/bibliography" SelectedStyle="/APASixthEditionOfficeOnline.xsl" StyleName="APA" Version="6"/>
-</file>
-
-<file path=customXml/item2.xml><?xml version="1.0" encoding="utf-8"?>
 <p:properties xmlns:p="http://schemas.microsoft.com/office/2006/metadata/properties" xmlns:xsi="http://www.w3.org/2001/XMLSchema-instance" xmlns:pc="http://schemas.microsoft.com/office/infopath/2007/PartnerControls">
   <documentManagement>
     <_ip_UnifiedCompliancePolicyUIAction xmlns="http://schemas.microsoft.com/sharepoint/v3" xsi:nil="true"/>
@@ -1777,7 +3943,7 @@
 </p:properties>
 </file>
 
-<file path=customXml/item3.xml><?xml version="1.0" encoding="utf-8"?>
+<file path=customXml/item2.xml><?xml version="1.0" encoding="utf-8"?>
 <?mso-contentType ?>
 <FormTemplates xmlns="http://schemas.microsoft.com/sharepoint/v3/contenttype/forms">
   <Display>DocumentLibraryForm</Display>
@@ -1786,7 +3952,7 @@
 </FormTemplates>
 </file>
 
-<file path=customXml/item4.xml><?xml version="1.0" encoding="utf-8"?>
+<file path=customXml/item3.xml><?xml version="1.0" encoding="utf-8"?>
 <ct:contentTypeSchema xmlns:ct="http://schemas.microsoft.com/office/2006/metadata/contentType" xmlns:ma="http://schemas.microsoft.com/office/2006/metadata/properties/metaAttributes" ct:_="" ma:_="" ma:contentTypeName="Document" ma:contentTypeID="0x01010079F111ED35F8CC479449609E8A0923A6" ma:contentTypeVersion="30" ma:contentTypeDescription="Create a new document." ma:contentTypeScope="" ma:versionID="cec0622158e8f13124e9e8fd4de31bd1">
   <xsd:schema xmlns:xsd="http://www.w3.org/2001/XMLSchema" xmlns:xs="http://www.w3.org/2001/XMLSchema" xmlns:p="http://schemas.microsoft.com/office/2006/metadata/properties" xmlns:ns1="http://schemas.microsoft.com/sharepoint/v3" xmlns:ns2="71af3243-3dd4-4a8d-8c0d-dd76da1f02a5" xmlns:ns3="16c05727-aa75-4e4a-9b5f-8a80a1165891" xmlns:ns4="230e9df3-be65-4c73-a93b-d1236ebd677e" targetNamespace="http://schemas.microsoft.com/office/2006/metadata/properties" ma:root="true" ma:fieldsID="3b52f30ab005d15df08657af532e6e38" ns1:_="" ns2:_="" ns3:_="" ns4:_="">
     <xsd:import namespace="http://schemas.microsoft.com/sharepoint/v3"/>
@@ -2104,15 +4270,11 @@
 </ct:contentTypeSchema>
 </file>
 
-<file path=customXml/itemProps1.xml><?xml version="1.0" encoding="utf-8"?>
-<ds:datastoreItem xmlns:ds="http://schemas.openxmlformats.org/officeDocument/2006/customXml" ds:itemID="{50C72F2C-7F12-CD49-83C5-6C402A54E798}">
-  <ds:schemaRefs>
-    <ds:schemaRef ds:uri="http://schemas.openxmlformats.org/officeDocument/2006/bibliography"/>
-  </ds:schemaRefs>
-</ds:datastoreItem>
+<file path=customXml/item4.xml><?xml version="1.0" encoding="utf-8"?>
+<b:Sources xmlns:b="http://schemas.openxmlformats.org/officeDocument/2006/bibliography" xmlns="http://schemas.openxmlformats.org/officeDocument/2006/bibliography" SelectedStyle="/APASixthEditionOfficeOnline.xsl" StyleName="APA" Version="6"/>
 </file>
 
-<file path=customXml/itemProps2.xml><?xml version="1.0" encoding="utf-8"?>
+<file path=customXml/itemProps1.xml><?xml version="1.0" encoding="utf-8"?>
 <ds:datastoreItem xmlns:ds="http://schemas.openxmlformats.org/officeDocument/2006/customXml" ds:itemID="{B0DABF2B-545D-49E1-AB80-039B21EE4E27}">
   <ds:schemaRefs>
     <ds:schemaRef ds:uri="http://schemas.microsoft.com/office/2006/metadata/properties"/>
@@ -2125,7 +4287,7 @@
 </ds:datastoreItem>
 </file>
 
-<file path=customXml/itemProps3.xml><?xml version="1.0" encoding="utf-8"?>
+<file path=customXml/itemProps2.xml><?xml version="1.0" encoding="utf-8"?>
 <ds:datastoreItem xmlns:ds="http://schemas.openxmlformats.org/officeDocument/2006/customXml" ds:itemID="{80C97E1B-B454-4DED-B1F3-34450391BFC8}">
   <ds:schemaRefs>
     <ds:schemaRef ds:uri="http://schemas.microsoft.com/sharepoint/v3/contenttype/forms"/>
@@ -2133,7 +4295,7 @@
 </ds:datastoreItem>
 </file>
 
-<file path=customXml/itemProps4.xml><?xml version="1.0" encoding="utf-8"?>
+<file path=customXml/itemProps3.xml><?xml version="1.0" encoding="utf-8"?>
 <ds:datastoreItem xmlns:ds="http://schemas.openxmlformats.org/officeDocument/2006/customXml" ds:itemID="{C8926C82-C580-4C96-8DDE-44DD30CAB6EC}">
   <ds:schemaRefs>
     <ds:schemaRef ds:uri="http://schemas.microsoft.com/office/2006/metadata/contentType"/>
@@ -2154,6 +4316,14 @@
 </ds:datastoreItem>
 </file>
 
+<file path=customXml/itemProps4.xml><?xml version="1.0" encoding="utf-8"?>
+<ds:datastoreItem xmlns:ds="http://schemas.openxmlformats.org/officeDocument/2006/customXml" ds:itemID="{50C72F2C-7F12-CD49-83C5-6C402A54E798}">
+  <ds:schemaRefs>
+    <ds:schemaRef ds:uri="http://schemas.openxmlformats.org/officeDocument/2006/bibliography"/>
+  </ds:schemaRefs>
+</ds:datastoreItem>
+</file>
+
 <file path=docMetadata/LabelInfo.xml><?xml version="1.0" encoding="utf-8"?>
 <clbl:labelList xmlns:clbl="http://schemas.microsoft.com/office/2020/mipLabelMetadata"/>
 </file>
</xml_diff>